<commit_message>
fix merge and lostm data
</commit_message>
<xml_diff>
--- a/foldertest/fsf.docx
+++ b/foldertest/fsf.docx
@@ -20,6 +20,31 @@
         </w:rPr>
         <w:t>1 Временный разде да да 1 hf</w:t>
       </w:r>
+      <w:proofErr w:type="spellStart"/>
+      <w:r>
+        <w:rPr>
+          <w:rFonts w:ascii="Times New Roman" w:hAnsi="Times New Roman"/>
+          <w:color w:val="000000"/>
+          <w:lang w:val="ru-RU"/>
+        </w:rPr>
+      </w:r>
+      <w:proofErr w:type="spellEnd"/>
+      <w:r>
+        <w:rPr>
+          <w:rFonts w:ascii="Times New Roman" w:hAnsi="Times New Roman"/>
+          <w:color w:val="000000"/>
+          <w:lang w:val="ru-RU"/>
+        </w:rPr>
+      </w:r>
+      <w:proofErr w:type="spellStart"/>
+      <w:r>
+        <w:rPr>
+          <w:rFonts w:ascii="Times New Roman" w:hAnsi="Times New Roman"/>
+          <w:color w:val="000000"/>
+          <w:lang w:val="ru-RU"/>
+        </w:rPr>
+      </w:r>
+      <w:proofErr w:type="spellEnd"/>
     </w:p>
     <w:p>
       <w:pPr>
@@ -39,6 +64,42 @@
         </w:rPr>
         <w:t>1.1 Нету как жадь подраздлffffе 1.1</w:t>
       </w:r>
+      <w:proofErr w:type="spellStart"/>
+      <w:r>
+        <w:rPr>
+          <w:rFonts w:ascii="Times New Roman" w:hAnsi="Times New Roman"/>
+          <w:color w:val="000000"/>
+          <w:sz w:val="28"/>
+          <w:lang w:val="ru-RU"/>
+        </w:rPr>
+      </w:r>
+      <w:proofErr w:type="spellEnd"/>
+      <w:r>
+        <w:rPr>
+          <w:rFonts w:ascii="Times New Roman" w:hAnsi="Times New Roman"/>
+          <w:color w:val="000000"/>
+          <w:sz w:val="28"/>
+          <w:lang w:val="ru-RU"/>
+        </w:rPr>
+      </w:r>
+      <w:proofErr w:type="spellStart"/>
+      <w:r>
+        <w:rPr>
+          <w:rFonts w:ascii="Times New Roman" w:hAnsi="Times New Roman"/>
+          <w:color w:val="000000"/>
+          <w:sz w:val="28"/>
+          <w:lang w:val="ru-RU"/>
+        </w:rPr>
+      </w:r>
+      <w:proofErr w:type="spellEnd"/>
+      <w:r>
+        <w:rPr>
+          <w:rFonts w:ascii="Times New Roman" w:hAnsi="Times New Roman"/>
+          <w:color w:val="000000"/>
+          <w:sz w:val="28"/>
+          <w:lang w:val="ru-RU"/>
+        </w:rPr>
+      </w:r>
     </w:p>
     <w:p>
       <w:pPr>
@@ -49,6 +110,7 @@
           <w:lang w:val="ru-RU"/>
         </w:rPr>
       </w:pPr>
+      <w:proofErr w:type="spellStart"/>
       <w:r>
         <w:rPr>
           <w:rFonts w:ascii="Times New Roman" w:hAnsi="Times New Roman"/>
@@ -56,13 +118,64 @@
           <w:sz w:val="28"/>
           <w:lang w:val="ru-RU"/>
         </w:rPr>
-        <w:t xml:space="preserve">Новут от текст 1.1 как жаь твовв </w:t>
+        <w:t>Новут</w:t>
+      </w:r>
+      <w:proofErr w:type="spellEnd"/>
+      <w:r>
+        <w:rPr>
+          <w:rFonts w:ascii="Times New Roman" w:hAnsi="Times New Roman"/>
+          <w:color w:val="000000"/>
+          <w:sz w:val="28"/>
+          <w:lang w:val="ru-RU"/>
+        </w:rPr>
+        <w:t xml:space="preserve"> от текст 1.1 как </w:t>
+      </w:r>
+      <w:proofErr w:type="spellStart"/>
+      <w:r>
+        <w:rPr>
+          <w:rFonts w:ascii="Times New Roman" w:hAnsi="Times New Roman"/>
+          <w:color w:val="000000"/>
+          <w:sz w:val="28"/>
+          <w:lang w:val="ru-RU"/>
+        </w:rPr>
+        <w:t>жаь</w:t>
+      </w:r>
+      <w:proofErr w:type="spellEnd"/>
+      <w:r>
+        <w:rPr>
+          <w:rFonts w:ascii="Times New Roman" w:hAnsi="Times New Roman"/>
+          <w:color w:val="000000"/>
+          <w:sz w:val="28"/>
+          <w:lang w:val="ru-RU"/>
+        </w:rPr>
+        <w:t xml:space="preserve"> </w:t>
+      </w:r>
+      <w:proofErr w:type="spellStart"/>
+      <w:r>
+        <w:rPr>
+          <w:rFonts w:ascii="Times New Roman" w:hAnsi="Times New Roman"/>
+          <w:color w:val="000000"/>
+          <w:sz w:val="28"/>
+          <w:lang w:val="ru-RU"/>
+        </w:rPr>
+        <w:t>твовв</w:t>
+      </w:r>
+      <w:proofErr w:type="spellEnd"/>
+      <w:r>
+        <w:rPr>
+          <w:rFonts w:ascii="Times New Roman" w:hAnsi="Times New Roman"/>
+          <w:color w:val="000000"/>
+          <w:sz w:val="28"/>
+          <w:lang w:val="ru-RU"/>
+        </w:rPr>
+        <w:t xml:space="preserve"> </w:t>
       </w:r>
     </w:p>
     <w:p>
       <w:pPr>
         <w:spacing w:before="280" w:after="0" w:line="240" w:lineRule="auto"/>
       </w:pPr>
+      <w:proofErr w:type="spellStart"/>
       <w:r>
         <w:rPr>
           <w:rFonts w:ascii="Times New Roman" w:hAnsi="Times New Roman"/>
@@ -71,6 +184,55 @@
         </w:rPr>
         <w:t>Таблица 1.1 – Кпо ав лввлвлвллвв</w:t>
       </w:r>
+      <w:proofErr w:type="spellEnd"/>
+      <w:r>
+        <w:rPr>
+          <w:rFonts w:ascii="Times New Roman" w:hAnsi="Times New Roman"/>
+          <w:color w:val="000000"/>
+          <w:sz w:val="28"/>
+        </w:rPr>
+      </w:r>
+      <w:proofErr w:type="spellStart"/>
+      <w:r>
+        <w:rPr>
+          <w:rFonts w:ascii="Times New Roman" w:hAnsi="Times New Roman"/>
+          <w:color w:val="000000"/>
+          <w:sz w:val="28"/>
+        </w:rPr>
+      </w:r>
+      <w:proofErr w:type="spellEnd"/>
+      <w:r>
+        <w:rPr>
+          <w:rFonts w:ascii="Times New Roman" w:hAnsi="Times New Roman"/>
+          <w:color w:val="000000"/>
+          <w:sz w:val="28"/>
+        </w:rPr>
+      </w:r>
+      <w:proofErr w:type="spellStart"/>
+      <w:r>
+        <w:rPr>
+          <w:rFonts w:ascii="Times New Roman" w:hAnsi="Times New Roman"/>
+          <w:color w:val="000000"/>
+          <w:sz w:val="28"/>
+        </w:rPr>
+      </w:r>
+      <w:proofErr w:type="spellEnd"/>
+      <w:r>
+        <w:rPr>
+          <w:rFonts w:ascii="Times New Roman" w:hAnsi="Times New Roman"/>
+          <w:color w:val="000000"/>
+          <w:sz w:val="28"/>
+        </w:rPr>
+      </w:r>
+      <w:proofErr w:type="spellStart"/>
+      <w:r>
+        <w:rPr>
+          <w:rFonts w:ascii="Times New Roman" w:hAnsi="Times New Roman"/>
+          <w:color w:val="000000"/>
+          <w:sz w:val="28"/>
+        </w:rPr>
+      </w:r>
+      <w:proofErr w:type="spellEnd"/>
     </w:p>
     <w:tbl>
       <w:tblPr>
@@ -127,6 +289,7 @@
               <w:spacing w:after="0" w:line="240" w:lineRule="auto"/>
               <w:jc w:val="center"/>
             </w:pPr>
+            <w:proofErr w:type="spellStart"/>
             <w:r>
               <w:rPr>
                 <w:rFonts w:ascii="Times New Roman" w:hAnsi="Times New Roman"/>
@@ -135,6 +298,7 @@
               </w:rPr>
               <w:t>аыф</w:t>
             </w:r>
+            <w:proofErr w:type="spellEnd"/>
           </w:p>
         </w:tc>
         <w:tc>
@@ -153,6 +317,7 @@
               <w:spacing w:after="0" w:line="240" w:lineRule="auto"/>
               <w:jc w:val="center"/>
             </w:pPr>
+            <w:proofErr w:type="spellStart"/>
             <w:r>
               <w:rPr>
                 <w:rFonts w:ascii="Times New Roman" w:hAnsi="Times New Roman"/>
@@ -161,6 +326,7 @@
               </w:rPr>
               <w:t>авы</w:t>
             </w:r>
+            <w:proofErr w:type="spellEnd"/>
           </w:p>
         </w:tc>
         <w:tc>
@@ -179,6 +345,7 @@
               <w:spacing w:after="0" w:line="240" w:lineRule="auto"/>
               <w:jc w:val="center"/>
             </w:pPr>
+            <w:proofErr w:type="spellStart"/>
             <w:r>
               <w:rPr>
                 <w:rFonts w:ascii="Times New Roman" w:hAnsi="Times New Roman"/>
@@ -187,6 +354,7 @@
               </w:rPr>
               <w:t>аыв</w:t>
             </w:r>
+            <w:proofErr w:type="spellEnd"/>
           </w:p>
         </w:tc>
       </w:tr>
@@ -200,7 +368,6 @@
               <w:bottom w:val="single" w:sz="4" w:space="0" w:color="000000"/>
               <w:right w:val="single" w:sz="4" w:space="0" w:color="000000"/>
             </w:tcBorders>
-            <w:vAlign w:val="center"/>
           </w:tcPr>
           <w:p>
             <w:pPr>
@@ -233,6 +400,7 @@
               <w:spacing w:after="0" w:line="240" w:lineRule="auto"/>
               <w:jc w:val="center"/>
             </w:pPr>
+            <w:proofErr w:type="spellStart"/>
             <w:r>
               <w:rPr>
                 <w:rFonts w:ascii="Times New Roman" w:hAnsi="Times New Roman"/>
@@ -241,6 +409,7 @@
               </w:rPr>
               <w:t>аы</w:t>
             </w:r>
+            <w:proofErr w:type="spellEnd"/>
           </w:p>
         </w:tc>
         <w:tc>
@@ -259,6 +428,7 @@
               <w:spacing w:after="0" w:line="240" w:lineRule="auto"/>
               <w:jc w:val="center"/>
             </w:pPr>
+            <w:proofErr w:type="spellStart"/>
             <w:r>
               <w:rPr>
                 <w:rFonts w:ascii="Times New Roman" w:hAnsi="Times New Roman"/>
@@ -267,6 +437,7 @@
               </w:rPr>
               <w:t>аыв</w:t>
             </w:r>
+            <w:proofErr w:type="spellEnd"/>
           </w:p>
         </w:tc>
         <w:tc>
@@ -305,6 +476,7 @@
               <w:spacing w:after="0" w:line="240" w:lineRule="auto"/>
               <w:jc w:val="center"/>
             </w:pPr>
+            <w:proofErr w:type="spellStart"/>
             <w:r>
               <w:rPr>
                 <w:rFonts w:ascii="Times New Roman" w:hAnsi="Times New Roman"/>
@@ -313,6 +485,7 @@
               </w:rPr>
               <w:t>афыа</w:t>
             </w:r>
+            <w:proofErr w:type="spellEnd"/>
           </w:p>
         </w:tc>
         <w:tc>
@@ -331,6 +504,7 @@
               <w:spacing w:after="0" w:line="240" w:lineRule="auto"/>
               <w:jc w:val="center"/>
             </w:pPr>
+            <w:proofErr w:type="spellStart"/>
             <w:r>
               <w:rPr>
                 <w:rFonts w:ascii="Times New Roman" w:hAnsi="Times New Roman"/>
@@ -339,6 +513,7 @@
               </w:rPr>
               <w:t>аыф</w:t>
             </w:r>
+            <w:proofErr w:type="spellEnd"/>
           </w:p>
         </w:tc>
         <w:tc>
@@ -357,6 +532,7 @@
               <w:spacing w:after="0" w:line="240" w:lineRule="auto"/>
               <w:jc w:val="center"/>
             </w:pPr>
+            <w:proofErr w:type="spellStart"/>
             <w:r>
               <w:rPr>
                 <w:rFonts w:ascii="Times New Roman" w:hAnsi="Times New Roman"/>
@@ -365,6 +541,7 @@
               </w:rPr>
               <w:t>авы</w:t>
             </w:r>
+            <w:proofErr w:type="spellEnd"/>
           </w:p>
         </w:tc>
         <w:tc>
@@ -383,6 +560,7 @@
               <w:spacing w:after="0" w:line="240" w:lineRule="auto"/>
               <w:jc w:val="center"/>
             </w:pPr>
+            <w:proofErr w:type="spellStart"/>
             <w:r>
               <w:rPr>
                 <w:rFonts w:ascii="Times New Roman" w:hAnsi="Times New Roman"/>
@@ -391,6 +569,7 @@
               </w:rPr>
               <w:t>аыв</w:t>
             </w:r>
+            <w:proofErr w:type="spellEnd"/>
           </w:p>
         </w:tc>
       </w:tr>
@@ -447,6 +626,7 @@
         <w:spacing w:before="120" w:after="280" w:line="240" w:lineRule="auto"/>
         <w:jc w:val="center"/>
       </w:pPr>
+      <w:proofErr w:type="spellStart"/>
       <w:r>
         <w:rPr>
           <w:rFonts w:ascii="Times New Roman" w:hAnsi="Times New Roman"/>
@@ -455,6 +635,23 @@
         </w:rPr>
         <w:t>Рисунок 1.1 – ринско</w:t>
       </w:r>
+      <w:proofErr w:type="spellEnd"/>
+      <w:r>
+        <w:rPr>
+          <w:rFonts w:ascii="Times New Roman" w:hAnsi="Times New Roman"/>
+          <w:color w:val="000000"/>
+          <w:sz w:val="28"/>
+        </w:rPr>
+      </w:r>
+      <w:proofErr w:type="spellStart"/>
+      <w:r>
+        <w:rPr>
+          <w:rFonts w:ascii="Times New Roman" w:hAnsi="Times New Roman"/>
+          <w:color w:val="000000"/>
+          <w:sz w:val="28"/>
+        </w:rPr>
+      </w:r>
+      <w:proofErr w:type="spellEnd"/>
     </w:p>
     <w:p>
       <w:pPr>
@@ -473,7 +670,25 @@
           <w:color w:val="000000"/>
           <w:sz w:val="24"/>
         </w:rPr>
-        <w:t>def add_text(self):</w:t>
+        <w:t xml:space="preserve">def </w:t>
+      </w:r>
+      <w:proofErr w:type="spellStart"/>
+      <w:r>
+        <w:rPr>
+          <w:rFonts w:ascii="Courier New" w:hAnsi="Courier New"/>
+          <w:color w:val="000000"/>
+          <w:sz w:val="24"/>
+        </w:rPr>
+        <w:t>add_text</w:t>
+      </w:r>
+      <w:proofErr w:type="spellEnd"/>
+      <w:r>
+        <w:rPr>
+          <w:rFonts w:ascii="Courier New" w:hAnsi="Courier New"/>
+          <w:color w:val="000000"/>
+          <w:sz w:val="24"/>
+        </w:rPr>
+        <w:t>(self):</w:t>
       </w:r>
       <w:r>
         <w:rPr>
@@ -482,7 +697,43 @@
           <w:sz w:val="24"/>
         </w:rPr>
         <w:br/>
-        <w:t xml:space="preserve">        selected_elem = self.get_selected_element()</w:t>
+        <w:t xml:space="preserve">        </w:t>
+      </w:r>
+      <w:proofErr w:type="spellStart"/>
+      <w:r>
+        <w:rPr>
+          <w:rFonts w:ascii="Courier New" w:hAnsi="Courier New"/>
+          <w:color w:val="000000"/>
+          <w:sz w:val="24"/>
+        </w:rPr>
+        <w:t>selected_elem</w:t>
+      </w:r>
+      <w:proofErr w:type="spellEnd"/>
+      <w:r>
+        <w:rPr>
+          <w:rFonts w:ascii="Courier New" w:hAnsi="Courier New"/>
+          <w:color w:val="000000"/>
+          <w:sz w:val="24"/>
+        </w:rPr>
+        <w:t xml:space="preserve"> = </w:t>
+      </w:r>
+      <w:proofErr w:type="spellStart"/>
+      <w:r>
+        <w:rPr>
+          <w:rFonts w:ascii="Courier New" w:hAnsi="Courier New"/>
+          <w:color w:val="000000"/>
+          <w:sz w:val="24"/>
+        </w:rPr>
+        <w:t>self.get_selected_element</w:t>
+      </w:r>
+      <w:proofErr w:type="spellEnd"/>
+      <w:r>
+        <w:rPr>
+          <w:rFonts w:ascii="Courier New" w:hAnsi="Courier New"/>
+          <w:color w:val="000000"/>
+          <w:sz w:val="24"/>
+        </w:rPr>
+        <w:t>()</w:t>
       </w:r>
       <w:r>
         <w:rPr>
@@ -491,7 +742,25 @@
           <w:sz w:val="24"/>
         </w:rPr>
         <w:br/>
-        <w:t xml:space="preserve">        if not selected_elem:</w:t>
+        <w:t xml:space="preserve">        if not </w:t>
+      </w:r>
+      <w:proofErr w:type="spellStart"/>
+      <w:r>
+        <w:rPr>
+          <w:rFonts w:ascii="Courier New" w:hAnsi="Courier New"/>
+          <w:color w:val="000000"/>
+          <w:sz w:val="24"/>
+        </w:rPr>
+        <w:t>selected_elem</w:t>
+      </w:r>
+      <w:proofErr w:type="spellEnd"/>
+      <w:r>
+        <w:rPr>
+          <w:rFonts w:ascii="Courier New" w:hAnsi="Courier New"/>
+          <w:color w:val="000000"/>
+          <w:sz w:val="24"/>
+        </w:rPr>
+        <w:t>:</w:t>
       </w:r>
       <w:r>
         <w:rPr>
@@ -509,7 +778,43 @@
           <w:sz w:val="24"/>
         </w:rPr>
         <w:br/>
-        <w:t xml:space="preserve">        dialog = AddParagraphDialog(self.service.get_tree())</w:t>
+        <w:t xml:space="preserve">        dialog = </w:t>
+      </w:r>
+      <w:proofErr w:type="spellStart"/>
+      <w:r>
+        <w:rPr>
+          <w:rFonts w:ascii="Courier New" w:hAnsi="Courier New"/>
+          <w:color w:val="000000"/>
+          <w:sz w:val="24"/>
+        </w:rPr>
+        <w:t>AddParagraphDialog</w:t>
+      </w:r>
+      <w:proofErr w:type="spellEnd"/>
+      <w:r>
+        <w:rPr>
+          <w:rFonts w:ascii="Courier New" w:hAnsi="Courier New"/>
+          <w:color w:val="000000"/>
+          <w:sz w:val="24"/>
+        </w:rPr>
+        <w:t>(</w:t>
+      </w:r>
+      <w:proofErr w:type="spellStart"/>
+      <w:r>
+        <w:rPr>
+          <w:rFonts w:ascii="Courier New" w:hAnsi="Courier New"/>
+          <w:color w:val="000000"/>
+          <w:sz w:val="24"/>
+        </w:rPr>
+        <w:t>self.service.get_tree</w:t>
+      </w:r>
+      <w:proofErr w:type="spellEnd"/>
+      <w:r>
+        <w:rPr>
+          <w:rFonts w:ascii="Courier New" w:hAnsi="Courier New"/>
+          <w:color w:val="000000"/>
+          <w:sz w:val="24"/>
+        </w:rPr>
+        <w:t>())</w:t>
       </w:r>
       <w:r>
         <w:rPr>
@@ -518,7 +823,25 @@
           <w:sz w:val="24"/>
         </w:rPr>
         <w:br/>
-        <w:t xml:space="preserve">        if dialog.exec():</w:t>
+        <w:t xml:space="preserve">        if </w:t>
+      </w:r>
+      <w:proofErr w:type="spellStart"/>
+      <w:r>
+        <w:rPr>
+          <w:rFonts w:ascii="Courier New" w:hAnsi="Courier New"/>
+          <w:color w:val="000000"/>
+          <w:sz w:val="24"/>
+        </w:rPr>
+        <w:t>dialog.exec</w:t>
+      </w:r>
+      <w:proofErr w:type="spellEnd"/>
+      <w:r>
+        <w:rPr>
+          <w:rFonts w:ascii="Courier New" w:hAnsi="Courier New"/>
+          <w:color w:val="000000"/>
+          <w:sz w:val="24"/>
+        </w:rPr>
+        <w:t>():</w:t>
       </w:r>
       <w:r>
         <w:rPr>
@@ -527,7 +850,25 @@
           <w:sz w:val="24"/>
         </w:rPr>
         <w:br/>
-        <w:t xml:space="preserve">            _, _, text = dialog.get_data()</w:t>
+        <w:t xml:space="preserve">            _, _, text = </w:t>
+      </w:r>
+      <w:proofErr w:type="spellStart"/>
+      <w:r>
+        <w:rPr>
+          <w:rFonts w:ascii="Courier New" w:hAnsi="Courier New"/>
+          <w:color w:val="000000"/>
+          <w:sz w:val="24"/>
+        </w:rPr>
+        <w:t>dialog.get_data</w:t>
+      </w:r>
+      <w:proofErr w:type="spellEnd"/>
+      <w:r>
+        <w:rPr>
+          <w:rFonts w:ascii="Courier New" w:hAnsi="Courier New"/>
+          <w:color w:val="000000"/>
+          <w:sz w:val="24"/>
+        </w:rPr>
+        <w:t>()</w:t>
       </w:r>
       <w:r>
         <w:rPr>
@@ -536,7 +877,43 @@
           <w:sz w:val="24"/>
         </w:rPr>
         <w:br/>
-        <w:t xml:space="preserve">            # parent = self.service.get_parent(selected_elem)  # </w:t>
+        <w:t xml:space="preserve">            # parent = </w:t>
+      </w:r>
+      <w:proofErr w:type="spellStart"/>
+      <w:r>
+        <w:rPr>
+          <w:rFonts w:ascii="Courier New" w:hAnsi="Courier New"/>
+          <w:color w:val="000000"/>
+          <w:sz w:val="24"/>
+        </w:rPr>
+        <w:t>self.service.get_parent</w:t>
+      </w:r>
+      <w:proofErr w:type="spellEnd"/>
+      <w:r>
+        <w:rPr>
+          <w:rFonts w:ascii="Courier New" w:hAnsi="Courier New"/>
+          <w:color w:val="000000"/>
+          <w:sz w:val="24"/>
+        </w:rPr>
+        <w:t>(</w:t>
+      </w:r>
+      <w:proofErr w:type="spellStart"/>
+      <w:r>
+        <w:rPr>
+          <w:rFonts w:ascii="Courier New" w:hAnsi="Courier New"/>
+          <w:color w:val="000000"/>
+          <w:sz w:val="24"/>
+        </w:rPr>
+        <w:t>selected_elem</w:t>
+      </w:r>
+      <w:proofErr w:type="spellEnd"/>
+      <w:r>
+        <w:rPr>
+          <w:rFonts w:ascii="Courier New" w:hAnsi="Courier New"/>
+          <w:color w:val="000000"/>
+          <w:sz w:val="24"/>
+        </w:rPr>
+        <w:t xml:space="preserve">)  # </w:t>
       </w:r>
       <w:r>
         <w:rPr>
@@ -545,7 +922,25 @@
           <w:sz w:val="24"/>
         </w:rPr>
         <w:lastRenderedPageBreak/>
-        <w:t>Assume service has get_parent method</w:t>
+        <w:t xml:space="preserve">Assume service has </w:t>
+      </w:r>
+      <w:proofErr w:type="spellStart"/>
+      <w:r>
+        <w:rPr>
+          <w:rFonts w:ascii="Courier New" w:hAnsi="Courier New"/>
+          <w:color w:val="000000"/>
+          <w:sz w:val="24"/>
+        </w:rPr>
+        <w:t>get_parent</w:t>
+      </w:r>
+      <w:proofErr w:type="spellEnd"/>
+      <w:r>
+        <w:rPr>
+          <w:rFonts w:ascii="Courier New" w:hAnsi="Courier New"/>
+          <w:color w:val="000000"/>
+          <w:sz w:val="24"/>
+        </w:rPr>
+        <w:t xml:space="preserve"> method</w:t>
       </w:r>
       <w:r>
         <w:rPr>
@@ -554,7 +949,43 @@
           <w:sz w:val="24"/>
         </w:rPr>
         <w:br/>
-        <w:t xml:space="preserve">            self.service.add_paragraph(selected_elem, text, None)</w:t>
+        <w:t xml:space="preserve">            </w:t>
+      </w:r>
+      <w:proofErr w:type="spellStart"/>
+      <w:r>
+        <w:rPr>
+          <w:rFonts w:ascii="Courier New" w:hAnsi="Courier New"/>
+          <w:color w:val="000000"/>
+          <w:sz w:val="24"/>
+        </w:rPr>
+        <w:t>self.service.add_paragraph</w:t>
+      </w:r>
+      <w:proofErr w:type="spellEnd"/>
+      <w:r>
+        <w:rPr>
+          <w:rFonts w:ascii="Courier New" w:hAnsi="Courier New"/>
+          <w:color w:val="000000"/>
+          <w:sz w:val="24"/>
+        </w:rPr>
+        <w:t>(</w:t>
+      </w:r>
+      <w:proofErr w:type="spellStart"/>
+      <w:r>
+        <w:rPr>
+          <w:rFonts w:ascii="Courier New" w:hAnsi="Courier New"/>
+          <w:color w:val="000000"/>
+          <w:sz w:val="24"/>
+        </w:rPr>
+        <w:t>selected_elem</w:t>
+      </w:r>
+      <w:proofErr w:type="spellEnd"/>
+      <w:r>
+        <w:rPr>
+          <w:rFonts w:ascii="Courier New" w:hAnsi="Courier New"/>
+          <w:color w:val="000000"/>
+          <w:sz w:val="24"/>
+        </w:rPr>
+        <w:t>, text, None)</w:t>
       </w:r>
       <w:r>
         <w:rPr>
@@ -563,7 +994,25 @@
           <w:sz w:val="24"/>
         </w:rPr>
         <w:br/>
-        <w:t xml:space="preserve">            self.tree_view.populate_tree()</w:t>
+        <w:t xml:space="preserve">            </w:t>
+      </w:r>
+      <w:proofErr w:type="spellStart"/>
+      <w:r>
+        <w:rPr>
+          <w:rFonts w:ascii="Courier New" w:hAnsi="Courier New"/>
+          <w:color w:val="000000"/>
+          <w:sz w:val="24"/>
+        </w:rPr>
+        <w:t>self.tree_view.populate_tree</w:t>
+      </w:r>
+      <w:proofErr w:type="spellEnd"/>
+      <w:r>
+        <w:rPr>
+          <w:rFonts w:ascii="Courier New" w:hAnsi="Courier New"/>
+          <w:color w:val="000000"/>
+          <w:sz w:val="24"/>
+        </w:rPr>
+        <w:t>()</w:t>
       </w:r>
     </w:p>
     <w:p>
@@ -583,6 +1032,34 @@
         </w:rPr>
         <w:t>Листинг 1.1 – подпи литснг</w:t>
       </w:r>
+      <w:proofErr w:type="spellStart"/>
+      <w:r>
+        <w:rPr>
+          <w:rFonts w:ascii="Times New Roman" w:hAnsi="Times New Roman"/>
+          <w:color w:val="000000"/>
+          <w:sz w:val="28"/>
+          <w:lang w:val="ru-RU"/>
+        </w:rPr>
+      </w:r>
+      <w:proofErr w:type="spellEnd"/>
+      <w:r>
+        <w:rPr>
+          <w:rFonts w:ascii="Times New Roman" w:hAnsi="Times New Roman"/>
+          <w:color w:val="000000"/>
+          <w:sz w:val="28"/>
+          <w:lang w:val="ru-RU"/>
+        </w:rPr>
+      </w:r>
+      <w:proofErr w:type="spellStart"/>
+      <w:r>
+        <w:rPr>
+          <w:rFonts w:ascii="Times New Roman" w:hAnsi="Times New Roman"/>
+          <w:color w:val="000000"/>
+          <w:sz w:val="28"/>
+          <w:lang w:val="ru-RU"/>
+        </w:rPr>
+      </w:r>
+      <w:proofErr w:type="spellEnd"/>
     </w:p>
     <w:p>
       <w:pPr>
@@ -600,8 +1077,19 @@
           <w:sz w:val="28"/>
           <w:lang w:val="ru-RU"/>
         </w:rPr>
-        <w:t>–  певрйы</w:t>
+        <w:t xml:space="preserve">–  </w:t>
       </w:r>
+      <w:proofErr w:type="spellStart"/>
+      <w:r>
+        <w:rPr>
+          <w:rFonts w:ascii="Times New Roman" w:hAnsi="Times New Roman"/>
+          <w:color w:val="000000"/>
+          <w:sz w:val="28"/>
+          <w:lang w:val="ru-RU"/>
+        </w:rPr>
+        <w:t>певрйы</w:t>
+      </w:r>
+      <w:proofErr w:type="spellEnd"/>
     </w:p>
     <w:p>
       <w:pPr>
@@ -644,6 +1132,16 @@
         </w:rPr>
         <w:t>Листинг 1.2 – выввыввы</w:t>
       </w:r>
+      <w:proofErr w:type="spellStart"/>
+      <w:r>
+        <w:rPr>
+          <w:rFonts w:ascii="Times New Roman" w:hAnsi="Times New Roman"/>
+          <w:color w:val="000000"/>
+          <w:sz w:val="28"/>
+          <w:lang w:val="ru-RU"/>
+        </w:rPr>
+      </w:r>
+      <w:proofErr w:type="spellEnd"/>
     </w:p>
     <w:p>
       <w:pPr>
@@ -657,8 +1155,18 @@
           <w:color w:val="000000"/>
           <w:sz w:val="28"/>
         </w:rPr>
-        <w:t>–  второй</w:t>
+        <w:t xml:space="preserve">–  </w:t>
       </w:r>
+      <w:proofErr w:type="spellStart"/>
+      <w:r>
+        <w:rPr>
+          <w:rFonts w:ascii="Times New Roman" w:hAnsi="Times New Roman"/>
+          <w:color w:val="000000"/>
+          <w:sz w:val="28"/>
+        </w:rPr>
+        <w:t>второй</w:t>
+      </w:r>
+      <w:proofErr w:type="spellEnd"/>
     </w:p>
     <w:tbl>
       <w:tblPr>
@@ -811,6 +1319,22 @@
         </w:rPr>
         <w:t>1.1.1 театуоа у</w:t>
       </w:r>
+      <w:proofErr w:type="spellStart"/>
+      <w:r>
+        <w:rPr>
+          <w:rFonts w:ascii="Times New Roman" w:hAnsi="Times New Roman"/>
+          <w:color w:val="000000"/>
+          <w:sz w:val="28"/>
+        </w:rPr>
+      </w:r>
+      <w:proofErr w:type="spellEnd"/>
+      <w:r>
+        <w:rPr>
+          <w:rFonts w:ascii="Times New Roman" w:hAnsi="Times New Roman"/>
+          <w:color w:val="000000"/>
+          <w:sz w:val="28"/>
+        </w:rPr>
+      </w:r>
     </w:p>
     <w:p>
       <w:pPr>
@@ -838,6 +1362,7 @@
         </w:rPr>
         <w:t>.</w:t>
       </w:r>
+      <w:proofErr w:type="spellStart"/>
       <w:r>
         <w:rPr>
           <w:rFonts w:ascii="Times New Roman" w:hAnsi="Times New Roman"/>
@@ -846,6 +1371,7 @@
         </w:rPr>
         <w:t>ru</w:t>
       </w:r>
+      <w:proofErr w:type="spellEnd"/>
       <w:r>
         <w:rPr>
           <w:rFonts w:ascii="Times New Roman" w:hAnsi="Times New Roman"/>
@@ -870,7 +1396,27 @@
           <w:sz w:val="28"/>
           <w:lang w:val="ru-RU"/>
         </w:rPr>
-        <w:t>-анализ, но и воспользоваться нейроинструментами: генерировать тексты и изображения, работать с аудио- и видеофайлами, редактировать и</w:t>
+        <w:t xml:space="preserve">-анализ, но и воспользоваться </w:t>
+      </w:r>
+      <w:proofErr w:type="spellStart"/>
+      <w:r>
+        <w:rPr>
+          <w:rFonts w:ascii="Times New Roman" w:hAnsi="Times New Roman"/>
+          <w:color w:val="000000"/>
+          <w:sz w:val="28"/>
+          <w:lang w:val="ru-RU"/>
+        </w:rPr>
+        <w:t>нейроинструментами</w:t>
+      </w:r>
+      <w:proofErr w:type="spellEnd"/>
+      <w:r>
+        <w:rPr>
+          <w:rFonts w:ascii="Times New Roman" w:hAnsi="Times New Roman"/>
+          <w:color w:val="000000"/>
+          <w:sz w:val="28"/>
+          <w:lang w:val="ru-RU"/>
+        </w:rPr>
+        <w:t>: генерировать тексты и изображения, работать с аудио- и видеофайлами, редактировать и</w:t>
       </w:r>
     </w:p>
     <w:p>
@@ -887,6 +1433,47 @@
         </w:rPr>
         <w:t>1.2 дава провери дурака</w:t>
       </w:r>
+      <w:proofErr w:type="spellStart"/>
+      <w:r>
+        <w:rPr>
+          <w:rFonts w:ascii="Times New Roman" w:hAnsi="Times New Roman"/>
+          <w:color w:val="000000"/>
+          <w:sz w:val="28"/>
+        </w:rPr>
+      </w:r>
+      <w:proofErr w:type="spellEnd"/>
+      <w:r>
+        <w:rPr>
+          <w:rFonts w:ascii="Times New Roman" w:hAnsi="Times New Roman"/>
+          <w:color w:val="000000"/>
+          <w:sz w:val="28"/>
+        </w:rPr>
+      </w:r>
+      <w:proofErr w:type="spellStart"/>
+      <w:r>
+        <w:rPr>
+          <w:rFonts w:ascii="Times New Roman" w:hAnsi="Times New Roman"/>
+          <w:color w:val="000000"/>
+          <w:sz w:val="28"/>
+        </w:rPr>
+      </w:r>
+      <w:proofErr w:type="spellEnd"/>
+      <w:r>
+        <w:rPr>
+          <w:rFonts w:ascii="Times New Roman" w:hAnsi="Times New Roman"/>
+          <w:color w:val="000000"/>
+          <w:sz w:val="28"/>
+        </w:rPr>
+      </w:r>
+      <w:proofErr w:type="spellStart"/>
+      <w:r>
+        <w:rPr>
+          <w:rFonts w:ascii="Times New Roman" w:hAnsi="Times New Roman"/>
+          <w:color w:val="000000"/>
+          <w:sz w:val="28"/>
+        </w:rPr>
+      </w:r>
+      <w:proofErr w:type="spellEnd"/>
     </w:p>
     <w:p>
       <w:pPr>
@@ -917,6 +1504,15 @@
         </w:rPr>
         <w:t>1.3 вллввл</w:t>
       </w:r>
+      <w:proofErr w:type="spellStart"/>
+      <w:r>
+        <w:rPr>
+          <w:rFonts w:ascii="Times New Roman" w:hAnsi="Times New Roman"/>
+          <w:color w:val="000000"/>
+          <w:sz w:val="28"/>
+        </w:rPr>
+      </w:r>
+      <w:proofErr w:type="spellEnd"/>
     </w:p>
     <w:p>
       <w:pPr>
@@ -1000,6 +1596,16 @@
         </w:rPr>
         <w:t>1.4 тест подарезд</w:t>
       </w:r>
+      <w:proofErr w:type="spellStart"/>
+      <w:r>
+        <w:rPr>
+          <w:rFonts w:ascii="Times New Roman" w:hAnsi="Times New Roman"/>
+          <w:color w:val="000000"/>
+          <w:sz w:val="28"/>
+          <w:lang w:val="ru-RU"/>
+        </w:rPr>
+      </w:r>
+      <w:proofErr w:type="spellEnd"/>
     </w:p>
     <w:p>
       <w:pPr>
@@ -1010,6 +1616,7 @@
           <w:lang w:val="ru-RU"/>
         </w:rPr>
       </w:pPr>
+      <w:proofErr w:type="spellStart"/>
       <w:r>
         <w:rPr>
           <w:rFonts w:ascii="Times New Roman" w:hAnsi="Times New Roman"/>
@@ -1019,6 +1626,7 @@
         </w:rPr>
         <w:t>выфвф</w:t>
       </w:r>
+      <w:proofErr w:type="spellEnd"/>
     </w:p>
     <w:p>
       <w:pPr>
@@ -1051,7 +1659,25 @@
           <w:color w:val="000000"/>
           <w:sz w:val="28"/>
         </w:rPr>
-        <w:t>– новый 1;</w:t>
+        <w:t>– </w:t>
+      </w:r>
+      <w:proofErr w:type="spellStart"/>
+      <w:r>
+        <w:rPr>
+          <w:rFonts w:ascii="Times New Roman" w:hAnsi="Times New Roman"/>
+          <w:color w:val="000000"/>
+          <w:sz w:val="28"/>
+        </w:rPr>
+        <w:t>новый</w:t>
+      </w:r>
+      <w:proofErr w:type="spellEnd"/>
+      <w:r>
+        <w:rPr>
+          <w:rFonts w:ascii="Times New Roman" w:hAnsi="Times New Roman"/>
+          <w:color w:val="000000"/>
+          <w:sz w:val="28"/>
+        </w:rPr>
+        <w:t xml:space="preserve"> 1;</w:t>
       </w:r>
     </w:p>
     <w:p>
@@ -1066,7 +1692,25 @@
           <w:color w:val="000000"/>
           <w:sz w:val="28"/>
         </w:rPr>
-        <w:t>– новый 2.</w:t>
+        <w:t>– </w:t>
+      </w:r>
+      <w:proofErr w:type="spellStart"/>
+      <w:r>
+        <w:rPr>
+          <w:rFonts w:ascii="Times New Roman" w:hAnsi="Times New Roman"/>
+          <w:color w:val="000000"/>
+          <w:sz w:val="28"/>
+        </w:rPr>
+        <w:t>новый</w:t>
+      </w:r>
+      <w:proofErr w:type="spellEnd"/>
+      <w:r>
+        <w:rPr>
+          <w:rFonts w:ascii="Times New Roman" w:hAnsi="Times New Roman"/>
+          <w:color w:val="000000"/>
+          <w:sz w:val="28"/>
+        </w:rPr>
+        <w:t xml:space="preserve"> 2.</w:t>
       </w:r>
     </w:p>
     <w:p>
@@ -1083,7 +1727,25 @@
           <w:sz w:val="28"/>
           <w:lang w:val="ru-RU"/>
         </w:rPr>
-        <w:t>Таблица 2.1 – Описание</w:t>
+        <w:t>Таблица 2.1 – ОписаниеDS ADSA</w:t>
+      </w:r>
+      <w:proofErr w:type="spellStart"/>
+      <w:r>
+        <w:rPr>
+          <w:rFonts w:ascii="Times New Roman" w:hAnsi="Times New Roman"/>
+          <w:color w:val="000000"/>
+          <w:sz w:val="28"/>
+          <w:lang w:val="ru-RU"/>
+        </w:rPr>
+      </w:r>
+      <w:proofErr w:type="spellEnd"/>
+      <w:r>
+        <w:rPr>
+          <w:rFonts w:ascii="Times New Roman" w:hAnsi="Times New Roman"/>
+          <w:color w:val="000000"/>
+          <w:sz w:val="28"/>
+          <w:lang w:val="ru-RU"/>
+        </w:rPr>
       </w:r>
     </w:p>
     <w:tbl>
@@ -1102,6 +1764,10 @@
         <w:gridCol w:w="2422"/>
       </w:tblGrid>
       <w:tr>
+        <w:trPr>
+          <w:cantSplit/>
+          <w:trHeight w:val="1134"/>
+        </w:trPr>
         <w:tc>
           <w:tcPr>
             <w:tcW w:w="2422" w:type="dxa"/>
@@ -1112,25 +1778,118 @@
               <w:left w:val="single" w:sz="4" w:space="0" w:color="000000"/>
               <w:right w:val="single" w:sz="4" w:space="0" w:color="000000"/>
             </w:tcBorders>
+            <w:vAlign w:val="top"/>
+          </w:tcPr>
+          <w:p>
+            <w:pPr>
+              <w:spacing w:after="0" w:line="240" w:lineRule="auto"/>
+              <w:jc w:val="right"/>
+              <w:rPr>
+                <w:rFonts w:ascii="Times New Roman" w:hAnsi="Times New Roman"/>
+                <w:color w:val="000000"/>
+                <w:sz w:val="24"/>
+                <w:lang w:val="ru-RU"/>
+              </w:rPr>
+            </w:pPr>
+            <w:r>
+              <w:rPr>
+                <w:rFonts w:ascii="Times New Roman" w:hAnsi="Times New Roman"/>
+                <w:i w:val="0"/>
+                <w:color w:val="000000"/>
+                <w:sz w:val="24"/>
+              </w:rPr>
+              <w:t>IIIIIУ5пппп0</w:t>
+            </w:r>
+          </w:p>
+          <w:p>
+            <w:pPr>
+              <w:spacing w:after="0" w:line="240" w:lineRule="auto"/>
+              <w:jc w:val="both"/>
+              <w:rPr>
+                <w:rFonts w:ascii="Times New Roman" w:hAnsi="Times New Roman"/>
+                <w:color w:val="000000"/>
+                <w:sz w:val="24"/>
+                <w:lang w:val="ru-RU"/>
+              </w:rPr>
+            </w:pPr>
+          </w:p>
+        </w:tc>
+        <w:tc>
+          <w:tcPr>
+            <w:tcW w:w="2422" w:type="dxa"/>
+            <w:tcBorders>
+              <w:top w:val="single" w:sz="4" w:space="0" w:color="000000"/>
+              <w:left w:val="single" w:sz="4" w:space="0" w:color="000000"/>
+              <w:bottom w:val="single" w:sz="4" w:space="0" w:color="000000"/>
+              <w:right w:val="single" w:sz="4" w:space="0" w:color="000000"/>
+            </w:tcBorders>
+            <w:vAlign w:val="top"/>
+          </w:tcPr>
+          <w:p>
+            <w:pPr>
+              <w:spacing w:after="0" w:line="240" w:lineRule="auto"/>
+              <w:jc w:val="right"/>
+              <w:rPr>
+                <w:rFonts w:ascii="Times New Roman" w:hAnsi="Times New Roman"/>
+                <w:color w:val="000000"/>
+                <w:sz w:val="24"/>
+                <w:lang w:val="ru-RU"/>
+              </w:rPr>
+            </w:pPr>
+            <w:r>
+              <w:rPr>
+                <w:rFonts w:ascii="Times New Roman" w:hAnsi="Times New Roman"/>
+                <w:i w:val="0"/>
+                <w:color w:val="000000"/>
+                <w:sz w:val="24"/>
+                <w:lang w:val="ru-RU"/>
+              </w:rPr>
+              <w:t>2аDdDdDSAAD 3DSрти00000000нок для 0рабIIIIоты с контентом. Антиплагиат2,</w:t>
+            </w:r>
+          </w:p>
+        </w:tc>
+        <w:tc>
+          <w:tcPr>
+            <w:tcW w:w="2422" w:type="dxa"/>
+            <w:tcBorders>
+              <w:top w:val="single" w:sz="4" w:space="0" w:color="000000"/>
+              <w:left w:val="single" w:sz="4" w:space="0" w:color="000000"/>
+              <w:bottom w:val="single" w:sz="4" w:space="0" w:color="000000"/>
+              <w:right w:val="single" w:sz="4" w:space="0" w:color="000000"/>
+            </w:tcBorders>
             <w:vAlign w:val="center"/>
           </w:tcPr>
           <w:p>
             <w:pPr>
               <w:spacing w:after="0" w:line="240" w:lineRule="auto"/>
+              <w:jc w:val="right"/>
+              <w:rPr>
+                <w:rFonts w:ascii="Times New Roman" w:hAnsi="Times New Roman"/>
+                <w:color w:val="000000"/>
+                <w:sz w:val="24"/>
+                <w:lang w:val="ru-RU"/>
+              </w:rPr>
             </w:pPr>
             <w:r>
               <w:rPr>
                 <w:rFonts w:ascii="Times New Roman" w:hAnsi="Times New Roman"/>
+                <w:i w:val="0"/>
                 <w:color w:val="000000"/>
                 <w:sz w:val="24"/>
+                <w:lang w:val="ru-RU"/>
               </w:rPr>
-              <w:t>1</w:t>
+              <w:t>DSртин0ок1 для,</w:t>
             </w:r>
           </w:p>
           <w:p>
             <w:pPr>
               <w:spacing w:after="0" w:line="240" w:lineRule="auto"/>
-              <w:jc w:val="right"/>
+              <w:rPr>
+                <w:rFonts w:ascii="Times New Roman" w:hAnsi="Times New Roman"/>
+                <w:color w:val="000000"/>
+                <w:sz w:val="24"/>
+                <w:lang w:val="ru-RU"/>
+              </w:rPr>
             </w:pPr>
           </w:p>
         </w:tc>
@@ -1148,74 +1907,30 @@
           <w:p>
             <w:pPr>
               <w:spacing w:after="0" w:line="240" w:lineRule="auto"/>
-              <w:jc w:val="center"/>
+              <w:jc w:val="right"/>
+              <w:rPr>
+                <w:rFonts w:ascii="Times New Roman" w:hAnsi="Times New Roman"/>
+                <w:color w:val="000000"/>
+                <w:sz w:val="24"/>
+                <w:lang w:val="ru-RU"/>
+              </w:rPr>
             </w:pPr>
             <w:r>
               <w:rPr>
                 <w:rFonts w:ascii="Times New Roman" w:hAnsi="Times New Roman"/>
+                <w:i w:val="0"/>
                 <w:color w:val="000000"/>
                 <w:sz w:val="24"/>
+                <w:lang w:val="ru-RU"/>
               </w:rPr>
-              <w:t>2</w:t>
-            </w:r>
-          </w:p>
-        </w:tc>
-        <w:tc>
-          <w:tcPr>
-            <w:tcW w:w="2422" w:type="dxa"/>
-            <w:tcBorders>
-              <w:top w:val="single" w:sz="4" w:space="0" w:color="000000"/>
-              <w:left w:val="single" w:sz="4" w:space="0" w:color="000000"/>
-              <w:bottom w:val="single" w:sz="4" w:space="0" w:color="000000"/>
-              <w:right w:val="single" w:sz="4" w:space="0" w:color="000000"/>
-            </w:tcBorders>
-            <w:vAlign w:val="center"/>
-          </w:tcPr>
-          <w:p>
-            <w:pPr>
-              <w:spacing w:after="0" w:line="240" w:lineRule="auto"/>
-              <w:jc w:val="center"/>
-            </w:pPr>
-            <w:r>
-              <w:rPr>
-                <w:rFonts w:ascii="Times New Roman" w:hAnsi="Times New Roman"/>
-                <w:color w:val="000000"/>
-                <w:sz w:val="24"/>
-              </w:rPr>
-              <w:t>3</w:t>
-            </w:r>
-          </w:p>
-        </w:tc>
-        <w:tc>
-          <w:tcPr>
-            <w:tcW w:w="2422" w:type="dxa"/>
-            <w:tcBorders>
-              <w:top w:val="single" w:sz="4" w:space="0" w:color="000000"/>
-              <w:left w:val="single" w:sz="4" w:space="0" w:color="000000"/>
-              <w:bottom w:val="single" w:sz="4" w:space="0" w:color="000000"/>
-              <w:right w:val="single" w:sz="4" w:space="0" w:color="000000"/>
-            </w:tcBorders>
-            <w:vAlign w:val="center"/>
-          </w:tcPr>
-          <w:p>
-            <w:pPr>
-              <w:spacing w:after="0" w:line="240" w:lineRule="auto"/>
-              <w:jc w:val="center"/>
-            </w:pPr>
-            <w:r>
-              <w:rPr>
-                <w:rFonts w:ascii="Times New Roman" w:hAnsi="Times New Roman"/>
-                <w:color w:val="000000"/>
-                <w:sz w:val="24"/>
-              </w:rPr>
-              <w:t>4</w:t>
+              <w:t>40</w:t>
             </w:r>
           </w:p>
         </w:tc>
       </w:tr>
       <w:tr>
         <w:trPr>
-          <w:trHeight w:val="258"/>
+          <w:trHeight w:val="276"/>
         </w:trPr>
         <w:tc>
           <w:tcPr>
@@ -1233,6 +1948,12 @@
             <w:pPr>
               <w:spacing w:after="0" w:line="240" w:lineRule="auto"/>
               <w:jc w:val="right"/>
+              <w:rPr>
+                <w:rFonts w:ascii="Times New Roman" w:hAnsi="Times New Roman"/>
+                <w:color w:val="000000"/>
+                <w:sz w:val="24"/>
+                <w:lang w:val="ru-RU"/>
+              </w:rPr>
             </w:pPr>
           </w:p>
         </w:tc>
@@ -1246,46 +1967,86 @@
               <w:left w:val="single" w:sz="4" w:space="0" w:color="000000"/>
               <w:right w:val="single" w:sz="4" w:space="0" w:color="000000"/>
             </w:tcBorders>
-            <w:vAlign w:val="center"/>
+            <w:vAlign w:val="top"/>
           </w:tcPr>
           <w:p>
             <w:pPr>
               <w:spacing w:after="0" w:line="240" w:lineRule="auto"/>
-              <w:jc w:val="center"/>
+              <w:jc w:val="right"/>
+              <w:rPr>
+                <w:rFonts w:ascii="Times New Roman" w:hAnsi="Times New Roman"/>
+                <w:color w:val="000000"/>
+                <w:sz w:val="24"/>
+                <w:lang w:val="ru-RU"/>
+              </w:rPr>
             </w:pPr>
             <w:r>
-              <w:t>Проверка текстов на ошибки, уникальность и SEO-анализ. Нейросети для генерации статей и картинок для работы с контентом. Антиплагиат, быстрая и точная ...</w:t>
-              <w:br/>
+              <w:rPr>
+                <w:rFonts w:ascii="Times New Roman" w:hAnsi="Times New Roman"/>
+                <w:i w:val="0"/>
+                <w:color w:val="000000"/>
+                <w:sz w:val="24"/>
+              </w:rPr>
+              <w:t>IIIIПппппп09000</w:t>
             </w:r>
           </w:p>
           <w:p>
             <w:pPr>
               <w:spacing w:after="0" w:line="240" w:lineRule="auto"/>
-              <w:jc w:val="center"/>
+              <w:jc w:val="both"/>
+              <w:rPr>
+                <w:rFonts w:ascii="Times New Roman" w:hAnsi="Times New Roman"/>
+                <w:color w:val="000000"/>
+                <w:sz w:val="24"/>
+                <w:lang w:val="ru-RU"/>
+              </w:rPr>
             </w:pPr>
           </w:p>
           <w:p>
             <w:pPr>
               <w:spacing w:after="0" w:line="240" w:lineRule="auto"/>
-              <w:jc w:val="center"/>
+              <w:jc w:val="both"/>
+              <w:rPr>
+                <w:rFonts w:ascii="Times New Roman" w:hAnsi="Times New Roman"/>
+                <w:color w:val="000000"/>
+                <w:sz w:val="24"/>
+                <w:lang w:val="ru-RU"/>
+              </w:rPr>
             </w:pPr>
           </w:p>
           <w:p>
             <w:pPr>
               <w:spacing w:after="0" w:line="240" w:lineRule="auto"/>
-              <w:jc w:val="center"/>
+              <w:jc w:val="both"/>
+              <w:rPr>
+                <w:rFonts w:ascii="Times New Roman" w:hAnsi="Times New Roman"/>
+                <w:color w:val="000000"/>
+                <w:sz w:val="24"/>
+              </w:rPr>
             </w:pPr>
           </w:p>
           <w:p>
             <w:pPr>
               <w:spacing w:after="0" w:line="240" w:lineRule="auto"/>
-              <w:jc w:val="center"/>
+              <w:jc w:val="both"/>
+              <w:rPr>
+                <w:rFonts w:ascii="Times New Roman" w:hAnsi="Times New Roman"/>
+                <w:color w:val="000000"/>
+                <w:sz w:val="24"/>
+                <w:lang w:val="ru-RU"/>
+              </w:rPr>
             </w:pPr>
           </w:p>
           <w:p>
             <w:pPr>
               <w:spacing w:after="0" w:line="240" w:lineRule="auto"/>
-              <w:jc w:val="center"/>
+              <w:jc w:val="right"/>
+              <w:rPr>
+                <w:rFonts w:ascii="Times New Roman" w:hAnsi="Times New Roman"/>
+                <w:color w:val="000000"/>
+                <w:sz w:val="24"/>
+                <w:lang w:val="ru-RU"/>
+              </w:rPr>
             </w:pPr>
           </w:p>
         </w:tc>
@@ -1308,11 +2069,12 @@
           <w:p>
             <w:pPr>
               <w:spacing w:after="0" w:line="240" w:lineRule="auto"/>
-              <w:jc w:val="center"/>
+              <w:jc w:val="right"/>
             </w:pPr>
             <w:r>
               <w:rPr>
                 <w:rFonts w:ascii="Times New Roman" w:hAnsi="Times New Roman"/>
+                <w:i w:val="0"/>
                 <w:color w:val="000000"/>
                 <w:sz w:val="24"/>
               </w:rPr>
@@ -1334,9 +2096,16 @@
           <w:p>
             <w:pPr>
               <w:spacing w:after="0" w:line="240" w:lineRule="auto"/>
-              <w:jc w:val="center"/>
+              <w:jc w:val="right"/>
             </w:pPr>
-            <w:r/>
+            <w:r>
+              <w:rPr>
+                <w:rFonts w:ascii="Times New Roman" w:hAnsi="Times New Roman"/>
+                <w:i w:val="0"/>
+                <w:color w:val="000000"/>
+                <w:sz w:val="24"/>
+              </w:rPr>
+            </w:r>
           </w:p>
         </w:tc>
         <w:tc>
@@ -1353,9 +2122,16 @@
           <w:p>
             <w:pPr>
               <w:spacing w:after="0" w:line="240" w:lineRule="auto"/>
-              <w:jc w:val="center"/>
+              <w:jc w:val="right"/>
             </w:pPr>
-            <w:r/>
+            <w:r>
+              <w:rPr>
+                <w:rFonts w:ascii="Times New Roman" w:hAnsi="Times New Roman"/>
+                <w:i w:val="0"/>
+                <w:color w:val="000000"/>
+                <w:sz w:val="24"/>
+              </w:rPr>
+            </w:r>
           </w:p>
         </w:tc>
         <w:tc>
@@ -1372,9 +2148,16 @@
           <w:p>
             <w:pPr>
               <w:spacing w:after="0" w:line="240" w:lineRule="auto"/>
-              <w:jc w:val="center"/>
+              <w:jc w:val="right"/>
             </w:pPr>
-            <w:r/>
+            <w:r>
+              <w:rPr>
+                <w:rFonts w:ascii="Times New Roman" w:hAnsi="Times New Roman"/>
+                <w:i w:val="0"/>
+                <w:color w:val="000000"/>
+                <w:sz w:val="24"/>
+              </w:rPr>
+            </w:r>
           </w:p>
         </w:tc>
         <w:tc>
@@ -1414,14 +2197,21 @@
           <w:p>
             <w:pPr>
               <w:spacing w:after="0" w:line="240" w:lineRule="auto"/>
-              <w:jc w:val="center"/>
+              <w:jc w:val="right"/>
               <w:rPr>
                 <w:rFonts w:ascii="Times New Roman" w:hAnsi="Times New Roman"/>
                 <w:color w:val="000000"/>
                 <w:sz w:val="24"/>
               </w:rPr>
             </w:pPr>
-            <w:r/>
+            <w:r>
+              <w:rPr>
+                <w:rFonts w:ascii="Times New Roman" w:hAnsi="Times New Roman"/>
+                <w:i w:val="0"/>
+                <w:color w:val="000000"/>
+                <w:sz w:val="24"/>
+              </w:rPr>
+            </w:r>
           </w:p>
         </w:tc>
         <w:tc>
@@ -1438,14 +2228,21 @@
           <w:p>
             <w:pPr>
               <w:spacing w:after="0" w:line="240" w:lineRule="auto"/>
-              <w:jc w:val="center"/>
+              <w:jc w:val="right"/>
               <w:rPr>
                 <w:rFonts w:ascii="Times New Roman" w:hAnsi="Times New Roman"/>
                 <w:color w:val="000000"/>
                 <w:sz w:val="24"/>
               </w:rPr>
             </w:pPr>
-            <w:r/>
+            <w:r>
+              <w:rPr>
+                <w:rFonts w:ascii="Times New Roman" w:hAnsi="Times New Roman"/>
+                <w:i w:val="0"/>
+                <w:color w:val="000000"/>
+                <w:sz w:val="24"/>
+              </w:rPr>
+            </w:r>
           </w:p>
         </w:tc>
         <w:tc>
@@ -1462,14 +2259,21 @@
           <w:p>
             <w:pPr>
               <w:spacing w:after="0" w:line="240" w:lineRule="auto"/>
-              <w:jc w:val="center"/>
+              <w:jc w:val="right"/>
               <w:rPr>
                 <w:rFonts w:ascii="Times New Roman" w:hAnsi="Times New Roman"/>
                 <w:color w:val="000000"/>
                 <w:sz w:val="24"/>
               </w:rPr>
             </w:pPr>
-            <w:r/>
+            <w:r>
+              <w:rPr>
+                <w:rFonts w:ascii="Times New Roman" w:hAnsi="Times New Roman"/>
+                <w:i w:val="0"/>
+                <w:color w:val="000000"/>
+                <w:sz w:val="24"/>
+              </w:rPr>
+            </w:r>
           </w:p>
         </w:tc>
         <w:tc>
@@ -1486,14 +2290,21 @@
           <w:p>
             <w:pPr>
               <w:spacing w:after="0" w:line="240" w:lineRule="auto"/>
-              <w:jc w:val="center"/>
+              <w:jc w:val="right"/>
               <w:rPr>
                 <w:rFonts w:ascii="Times New Roman" w:hAnsi="Times New Roman"/>
                 <w:color w:val="000000"/>
                 <w:sz w:val="24"/>
               </w:rPr>
             </w:pPr>
-            <w:r/>
+            <w:r>
+              <w:rPr>
+                <w:rFonts w:ascii="Times New Roman" w:hAnsi="Times New Roman"/>
+                <w:i w:val="0"/>
+                <w:color w:val="000000"/>
+                <w:sz w:val="24"/>
+              </w:rPr>
+            </w:r>
           </w:p>
         </w:tc>
         <w:tc>
@@ -1533,14 +2344,21 @@
           <w:p>
             <w:pPr>
               <w:spacing w:after="0" w:line="240" w:lineRule="auto"/>
-              <w:jc w:val="center"/>
+              <w:jc w:val="right"/>
               <w:rPr>
                 <w:rFonts w:ascii="Times New Roman" w:hAnsi="Times New Roman"/>
                 <w:color w:val="000000"/>
                 <w:sz w:val="24"/>
               </w:rPr>
             </w:pPr>
-            <w:r/>
+            <w:r>
+              <w:rPr>
+                <w:rFonts w:ascii="Times New Roman" w:hAnsi="Times New Roman"/>
+                <w:i w:val="0"/>
+                <w:color w:val="000000"/>
+                <w:sz w:val="24"/>
+              </w:rPr>
+            </w:r>
           </w:p>
         </w:tc>
         <w:tc>
@@ -1557,14 +2375,21 @@
           <w:p>
             <w:pPr>
               <w:spacing w:after="0" w:line="240" w:lineRule="auto"/>
-              <w:jc w:val="center"/>
+              <w:jc w:val="right"/>
               <w:rPr>
                 <w:rFonts w:ascii="Times New Roman" w:hAnsi="Times New Roman"/>
                 <w:color w:val="000000"/>
                 <w:sz w:val="24"/>
               </w:rPr>
             </w:pPr>
-            <w:r/>
+            <w:r>
+              <w:rPr>
+                <w:rFonts w:ascii="Times New Roman" w:hAnsi="Times New Roman"/>
+                <w:i w:val="0"/>
+                <w:color w:val="000000"/>
+                <w:sz w:val="24"/>
+              </w:rPr>
+            </w:r>
           </w:p>
         </w:tc>
         <w:tc>
@@ -1581,14 +2406,21 @@
           <w:p>
             <w:pPr>
               <w:spacing w:after="0" w:line="240" w:lineRule="auto"/>
-              <w:jc w:val="center"/>
+              <w:jc w:val="right"/>
               <w:rPr>
                 <w:rFonts w:ascii="Times New Roman" w:hAnsi="Times New Roman"/>
                 <w:color w:val="000000"/>
                 <w:sz w:val="24"/>
               </w:rPr>
             </w:pPr>
-            <w:r/>
+            <w:r>
+              <w:rPr>
+                <w:rFonts w:ascii="Times New Roman" w:hAnsi="Times New Roman"/>
+                <w:i w:val="0"/>
+                <w:color w:val="000000"/>
+                <w:sz w:val="24"/>
+              </w:rPr>
+            </w:r>
           </w:p>
         </w:tc>
         <w:tc>
@@ -1605,14 +2437,24 @@
           <w:p>
             <w:pPr>
               <w:spacing w:after="0" w:line="240" w:lineRule="auto"/>
-              <w:jc w:val="center"/>
+              <w:jc w:val="right"/>
               <w:rPr>
                 <w:rFonts w:ascii="Times New Roman" w:hAnsi="Times New Roman"/>
                 <w:color w:val="000000"/>
                 <w:sz w:val="24"/>
               </w:rPr>
             </w:pPr>
-            <w:r/>
+            <w:proofErr w:type="spellStart"/>
+            <w:r>
+              <w:rPr>
+                <w:rFonts w:ascii="Times New Roman" w:hAnsi="Times New Roman"/>
+                <w:i w:val="0"/>
+                <w:color w:val="000000"/>
+                <w:sz w:val="24"/>
+              </w:rPr>
+              <w:t>выфв</w:t>
+            </w:r>
+            <w:proofErr w:type="spellEnd"/>
           </w:p>
         </w:tc>
         <w:tc>
@@ -1650,11 +2492,12 @@
           <w:p>
             <w:pPr>
               <w:spacing w:after="0" w:line="240" w:lineRule="auto"/>
-              <w:jc w:val="right"/>
+              <w:jc w:val="left"/>
             </w:pPr>
             <w:r>
               <w:rPr>
                 <w:rFonts w:ascii="Times New Roman" w:hAnsi="Times New Roman"/>
+                <w:i w:val="0"/>
                 <w:color w:val="000000"/>
                 <w:sz w:val="24"/>
               </w:rPr>
@@ -1738,6 +2581,7 @@
         <w:spacing w:after="0" w:line="240" w:lineRule="auto"/>
         <w:jc w:val="both"/>
       </w:pPr>
+      <w:proofErr w:type="spellStart"/>
       <w:r>
         <w:rPr>
           <w:rFonts w:ascii="Times New Roman" w:hAnsi="Times New Roman"/>
@@ -1746,6 +2590,23 @@
         </w:rPr>
         <w:t>Таблица 2.2 – Описание</w:t>
       </w:r>
+      <w:proofErr w:type="spellEnd"/>
+      <w:r>
+        <w:rPr>
+          <w:rFonts w:ascii="Times New Roman" w:hAnsi="Times New Roman"/>
+          <w:color w:val="000000"/>
+          <w:sz w:val="28"/>
+        </w:rPr>
+      </w:r>
+      <w:proofErr w:type="spellStart"/>
+      <w:r>
+        <w:rPr>
+          <w:rFonts w:ascii="Times New Roman" w:hAnsi="Times New Roman"/>
+          <w:color w:val="000000"/>
+          <w:sz w:val="28"/>
+        </w:rPr>
+      </w:r>
+      <w:proofErr w:type="spellEnd"/>
     </w:p>
     <w:tbl>
       <w:tblPr>
@@ -1807,6 +2668,13 @@
                 <w:sz w:val="24"/>
               </w:rPr>
               <w:t>2</w:t>
+            </w:r>
+            <w:r>
+              <w:rPr>
+                <w:rFonts w:ascii="Times New Roman" w:hAnsi="Times New Roman"/>
+                <w:color w:val="000000"/>
+                <w:sz w:val="24"/>
+              </w:rPr>
               <w:br/>
               <w:t>4 5</w:t>
             </w:r>
@@ -2937,7 +3805,7 @@
   <w:style w:type="paragraph" w:default="1" w:styleId="a1">
     <w:name w:val="Normal"/>
     <w:qFormat/>
-    <w:rsid w:val="00FC693F"/>
+    <w:rsid w:val="00FD13D3"/>
   </w:style>
   <w:style w:type="paragraph" w:styleId="1">
     <w:name w:val="heading 1"/>

</xml_diff>

<commit_message>
fix formula and move elemnet
</commit_message>
<xml_diff>
--- a/foldertest/fsf.docx
+++ b/foldertest/fsf.docx
@@ -1495,75 +1495,6 @@
         <w:pStyle w:val="21"/>
         <w:spacing w:before="360" w:after="240" w:line="240" w:lineRule="auto"/>
         <w:ind w:firstLine="709"/>
-      </w:pPr>
-      <w:r>
-        <w:rPr>
-          <w:rFonts w:ascii="Times New Roman" w:hAnsi="Times New Roman"/>
-          <w:color w:val="000000"/>
-          <w:sz w:val="28"/>
-        </w:rPr>
-        <w:t>1.3 вллввл</w:t>
-      </w:r>
-      <w:proofErr w:type="spellStart"/>
-      <w:r>
-        <w:rPr>
-          <w:rFonts w:ascii="Times New Roman" w:hAnsi="Times New Roman"/>
-          <w:color w:val="000000"/>
-          <w:sz w:val="28"/>
-        </w:rPr>
-      </w:r>
-      <w:proofErr w:type="spellEnd"/>
-    </w:p>
-    <w:p>
-      <w:pPr>
-        <w:spacing w:before="280" w:after="0" w:line="240" w:lineRule="auto"/>
-        <w:jc w:val="center"/>
-      </w:pPr>
-      <w:r>
-        <w:rPr>
-          <w:noProof/>
-        </w:rPr>
-        <w:drawing>
-          <wp:inline distT="0" distB="0" distL="0" distR="0" wp14:anchorId="1E3820ED" wp14:editId="6A53E4C2">
-            <wp:extent cx="4733925" cy="2781300"/>
-            <wp:effectExtent l="0" t="0" r="0" b="0"/>
-            <wp:docPr id="2" name="Picture 2"/>
-            <wp:cNvGraphicFramePr>
-              <a:graphicFrameLocks xmlns:a="http://schemas.openxmlformats.org/drawingml/2006/main" noChangeAspect="1"/>
-            </wp:cNvGraphicFramePr>
-            <a:graphic xmlns:a="http://schemas.openxmlformats.org/drawingml/2006/main">
-              <a:graphicData uri="http://schemas.openxmlformats.org/drawingml/2006/picture">
-                <pic:pic xmlns:pic="http://schemas.openxmlformats.org/drawingml/2006/picture">
-                  <pic:nvPicPr>
-                    <pic:cNvPr id="0" name="image.png"/>
-                    <pic:cNvPicPr/>
-                  </pic:nvPicPr>
-                  <pic:blipFill>
-                    <a:blip r:embed="rId7"/>
-                    <a:stretch>
-                      <a:fillRect/>
-                    </a:stretch>
-                  </pic:blipFill>
-                  <pic:spPr>
-                    <a:xfrm>
-                      <a:off x="0" y="0"/>
-                      <a:ext cx="4733925" cy="2781300"/>
-                    </a:xfrm>
-                    <a:prstGeom prst="rect">
-                      <a:avLst/>
-                    </a:prstGeom>
-                  </pic:spPr>
-                </pic:pic>
-              </a:graphicData>
-            </a:graphic>
-          </wp:inline>
-        </w:drawing>
-      </w:r>
-    </w:p>
-    <w:p>
-      <w:pPr>
-        <w:spacing w:before="120" w:after="280" w:line="240" w:lineRule="auto"/>
-        <w:jc w:val="center"/>
         <w:rPr>
           <w:lang w:val="ru-RU"/>
         </w:rPr>
@@ -1575,26 +1506,7 @@
           <w:sz w:val="28"/>
           <w:lang w:val="ru-RU"/>
         </w:rPr>
-        <w:t>Рисунок 1.2 – выв</w:t>
-      </w:r>
-    </w:p>
-    <w:p>
-      <w:pPr>
-        <w:pStyle w:val="21"/>
-        <w:spacing w:before="360" w:after="240" w:line="240" w:lineRule="auto"/>
-        <w:ind w:firstLine="709"/>
-        <w:rPr>
-          <w:lang w:val="ru-RU"/>
-        </w:rPr>
-      </w:pPr>
-      <w:r>
-        <w:rPr>
-          <w:rFonts w:ascii="Times New Roman" w:hAnsi="Times New Roman"/>
-          <w:color w:val="000000"/>
-          <w:sz w:val="28"/>
-          <w:lang w:val="ru-RU"/>
-        </w:rPr>
-        <w:t>1.4 тест подарезд</w:t>
+        <w:t>1.3 тест подарезд</w:t>
       </w:r>
       <w:proofErr w:type="spellStart"/>
       <w:r>
@@ -1647,6 +1559,164 @@
         <w:t>2 да новы 3 но он 2 к-то</w:t>
       </w:r>
     </w:p>
+    <w:p>
+      <w:pPr>
+        <w:spacing w:after="0" w:line="240" w:lineRule="auto"/>
+        <w:jc w:val="both"/>
+      </w:pPr>
+      <w:proofErr w:type="spellStart"/>
+      <w:r>
+        <w:rPr>
+          <w:rFonts w:ascii="Times New Roman" w:hAnsi="Times New Roman"/>
+          <w:color w:val="000000"/>
+          <w:sz w:val="28"/>
+        </w:rPr>
+        <w:t>Таблица 2.1 – Описание</w:t>
+      </w:r>
+      <w:proofErr w:type="spellEnd"/>
+      <w:r>
+        <w:rPr>
+          <w:rFonts w:ascii="Times New Roman" w:hAnsi="Times New Roman"/>
+          <w:color w:val="000000"/>
+          <w:sz w:val="28"/>
+        </w:rPr>
+      </w:r>
+      <w:proofErr w:type="spellStart"/>
+      <w:r>
+        <w:rPr>
+          <w:rFonts w:ascii="Times New Roman" w:hAnsi="Times New Roman"/>
+          <w:color w:val="000000"/>
+          <w:sz w:val="28"/>
+        </w:rPr>
+      </w:r>
+      <w:proofErr w:type="spellEnd"/>
+    </w:p>
+    <w:tbl>
+      <w:tblPr>
+        <w:tblW w:w="0" w:type="auto"/>
+        <w:tblLayout w:type="fixed"/>
+        <w:tblLook w:val="04A0" w:firstRow="1" w:lastRow="0" w:firstColumn="1" w:lastColumn="0" w:noHBand="0" w:noVBand="1"/>
+      </w:tblPr>
+      <w:tblGrid>
+        <w:gridCol w:w="4844"/>
+        <w:gridCol w:w="4844"/>
+      </w:tblGrid>
+      <w:tr>
+        <w:tc>
+          <w:tcPr>
+            <w:tcW w:w="4844" w:type="dxa"/>
+            <w:tcBorders>
+              <w:top w:val="single" w:sz="4" w:space="0" w:color="000000"/>
+              <w:left w:val="single" w:sz="4" w:space="0" w:color="000000"/>
+              <w:bottom w:val="single" w:sz="4" w:space="0" w:color="000000"/>
+              <w:right w:val="single" w:sz="4" w:space="0" w:color="000000"/>
+            </w:tcBorders>
+            <w:vAlign w:val="center"/>
+          </w:tcPr>
+          <w:p>
+            <w:pPr>
+              <w:spacing w:after="0" w:line="240" w:lineRule="auto"/>
+              <w:jc w:val="right"/>
+            </w:pPr>
+            <w:r>
+              <w:rPr>
+                <w:rFonts w:ascii="Times New Roman" w:hAnsi="Times New Roman"/>
+                <w:color w:val="000000"/>
+                <w:sz w:val="24"/>
+              </w:rPr>
+              <w:t>1</w:t>
+            </w:r>
+          </w:p>
+        </w:tc>
+        <w:tc>
+          <w:tcPr>
+            <w:tcW w:w="4844" w:type="dxa"/>
+            <w:vMerge w:val="restart"/>
+            <w:tcBorders>
+              <w:top w:val="single" w:sz="4" w:space="0" w:color="000000"/>
+              <w:left w:val="single" w:sz="4" w:space="0" w:color="000000"/>
+              <w:right w:val="single" w:sz="4" w:space="0" w:color="000000"/>
+            </w:tcBorders>
+            <w:vAlign w:val="center"/>
+          </w:tcPr>
+          <w:p>
+            <w:pPr>
+              <w:spacing w:after="0" w:line="240" w:lineRule="auto"/>
+              <w:jc w:val="right"/>
+            </w:pPr>
+            <w:r>
+              <w:rPr>
+                <w:rFonts w:ascii="Times New Roman" w:hAnsi="Times New Roman"/>
+                <w:color w:val="000000"/>
+                <w:sz w:val="24"/>
+              </w:rPr>
+              <w:t>2</w:t>
+            </w:r>
+            <w:r>
+              <w:rPr>
+                <w:rFonts w:ascii="Times New Roman" w:hAnsi="Times New Roman"/>
+                <w:color w:val="000000"/>
+                <w:sz w:val="24"/>
+              </w:rPr>
+              <w:br/>
+              <w:t>4 5</w:t>
+            </w:r>
+          </w:p>
+          <w:p>
+            <w:pPr>
+              <w:spacing w:after="0" w:line="240" w:lineRule="auto"/>
+              <w:jc w:val="right"/>
+            </w:pPr>
+          </w:p>
+        </w:tc>
+      </w:tr>
+      <w:tr>
+        <w:tc>
+          <w:tcPr>
+            <w:tcW w:w="4844" w:type="dxa"/>
+            <w:tcBorders>
+              <w:top w:val="single" w:sz="4" w:space="0" w:color="000000"/>
+              <w:left w:val="single" w:sz="4" w:space="0" w:color="000000"/>
+              <w:bottom w:val="single" w:sz="4" w:space="0" w:color="000000"/>
+              <w:right w:val="single" w:sz="4" w:space="0" w:color="000000"/>
+            </w:tcBorders>
+            <w:vAlign w:val="center"/>
+          </w:tcPr>
+          <w:p>
+            <w:pPr>
+              <w:spacing w:after="0" w:line="240" w:lineRule="auto"/>
+              <w:jc w:val="center"/>
+            </w:pPr>
+            <w:r>
+              <w:rPr>
+                <w:rFonts w:ascii="Times New Roman" w:hAnsi="Times New Roman"/>
+                <w:color w:val="000000"/>
+                <w:sz w:val="24"/>
+              </w:rPr>
+              <w:t>3</w:t>
+            </w:r>
+          </w:p>
+        </w:tc>
+        <w:tc>
+          <w:tcPr>
+            <w:tcW w:w="4844" w:type="dxa"/>
+            <w:vMerge/>
+            <w:tcBorders>
+              <w:left w:val="single" w:sz="4" w:space="0" w:color="000000"/>
+              <w:bottom w:val="single" w:sz="4" w:space="0" w:color="000000"/>
+              <w:right w:val="single" w:sz="4" w:space="0" w:color="000000"/>
+            </w:tcBorders>
+            <w:vAlign w:val="center"/>
+          </w:tcPr>
+          <w:p>
+            <w:pPr>
+              <w:spacing w:after="0" w:line="240" w:lineRule="auto"/>
+              <w:jc w:val="right"/>
+            </w:pPr>
+          </w:p>
+        </w:tc>
+      </w:tr>
+    </w:tbl>
     <w:p>
       <w:pPr>
         <w:spacing w:after="0" w:line="240" w:lineRule="auto"/>
@@ -1727,7 +1797,7 @@
           <w:sz w:val="28"/>
           <w:lang w:val="ru-RU"/>
         </w:rPr>
-        <w:t>Таблица 2.1 – ОписаниеDS ADSA</w:t>
+        <w:t>Таблица 2.2 – ОписаниеDS ADSA</w:t>
       </w:r>
       <w:proofErr w:type="spellStart"/>
       <w:r>
@@ -2528,6 +2598,23 @@
     </w:tbl>
     <w:p>
       <w:pPr>
+        <w:spacing w:line="240" w:lineRule="auto" w:before="280" w:after="0"/>
+        <w:ind w:left="0" w:right="0" w:firstLine="709"/>
+        <w:jc w:val="both"/>
+      </w:pPr>
+      <w:r>
+        <w:rPr>
+          <w:rFonts w:ascii="Times New Roman" w:hAnsi="Times New Roman"/>
+          <w:b w:val="0"/>
+          <w:i w:val="0"/>
+          <w:color w:val="000000"/>
+          <w:sz w:val="28"/>
+        </w:rPr>
+        <w:t>Ntrcnf vyjuj yt, sdftn yjdjn jy  b ,sdftnNtrcnf vyjuj yt, sdftn yjdjn jy  b ,sdftnNtrcnf vyjuj yt, sdftn yjdjn jy  b ,sdftnNtrcnf vyjuj yt, sdftn yjdjn jy  b ,sdftn</w:t>
+      </w:r>
+    </w:p>
+    <w:p>
+      <w:pPr>
         <w:pStyle w:val="ae"/>
         <w:numPr>
           <w:ilvl w:val="0"/>
@@ -2576,164 +2663,6 @@
         <w:t>И все</w:t>
       </w:r>
     </w:p>
-    <w:p>
-      <w:pPr>
-        <w:spacing w:after="0" w:line="240" w:lineRule="auto"/>
-        <w:jc w:val="both"/>
-      </w:pPr>
-      <w:proofErr w:type="spellStart"/>
-      <w:r>
-        <w:rPr>
-          <w:rFonts w:ascii="Times New Roman" w:hAnsi="Times New Roman"/>
-          <w:color w:val="000000"/>
-          <w:sz w:val="28"/>
-        </w:rPr>
-        <w:t>Таблица 2.2 – Описание</w:t>
-      </w:r>
-      <w:proofErr w:type="spellEnd"/>
-      <w:r>
-        <w:rPr>
-          <w:rFonts w:ascii="Times New Roman" w:hAnsi="Times New Roman"/>
-          <w:color w:val="000000"/>
-          <w:sz w:val="28"/>
-        </w:rPr>
-      </w:r>
-      <w:proofErr w:type="spellStart"/>
-      <w:r>
-        <w:rPr>
-          <w:rFonts w:ascii="Times New Roman" w:hAnsi="Times New Roman"/>
-          <w:color w:val="000000"/>
-          <w:sz w:val="28"/>
-        </w:rPr>
-      </w:r>
-      <w:proofErr w:type="spellEnd"/>
-    </w:p>
-    <w:tbl>
-      <w:tblPr>
-        <w:tblW w:w="0" w:type="auto"/>
-        <w:tblLayout w:type="fixed"/>
-        <w:tblLook w:val="04A0" w:firstRow="1" w:lastRow="0" w:firstColumn="1" w:lastColumn="0" w:noHBand="0" w:noVBand="1"/>
-      </w:tblPr>
-      <w:tblGrid>
-        <w:gridCol w:w="4844"/>
-        <w:gridCol w:w="4844"/>
-      </w:tblGrid>
-      <w:tr>
-        <w:tc>
-          <w:tcPr>
-            <w:tcW w:w="4844" w:type="dxa"/>
-            <w:tcBorders>
-              <w:top w:val="single" w:sz="4" w:space="0" w:color="000000"/>
-              <w:left w:val="single" w:sz="4" w:space="0" w:color="000000"/>
-              <w:bottom w:val="single" w:sz="4" w:space="0" w:color="000000"/>
-              <w:right w:val="single" w:sz="4" w:space="0" w:color="000000"/>
-            </w:tcBorders>
-            <w:vAlign w:val="center"/>
-          </w:tcPr>
-          <w:p>
-            <w:pPr>
-              <w:spacing w:after="0" w:line="240" w:lineRule="auto"/>
-              <w:jc w:val="right"/>
-            </w:pPr>
-            <w:r>
-              <w:rPr>
-                <w:rFonts w:ascii="Times New Roman" w:hAnsi="Times New Roman"/>
-                <w:color w:val="000000"/>
-                <w:sz w:val="24"/>
-              </w:rPr>
-              <w:t>1</w:t>
-            </w:r>
-          </w:p>
-        </w:tc>
-        <w:tc>
-          <w:tcPr>
-            <w:tcW w:w="4844" w:type="dxa"/>
-            <w:vMerge w:val="restart"/>
-            <w:tcBorders>
-              <w:top w:val="single" w:sz="4" w:space="0" w:color="000000"/>
-              <w:left w:val="single" w:sz="4" w:space="0" w:color="000000"/>
-              <w:right w:val="single" w:sz="4" w:space="0" w:color="000000"/>
-            </w:tcBorders>
-            <w:vAlign w:val="center"/>
-          </w:tcPr>
-          <w:p>
-            <w:pPr>
-              <w:spacing w:after="0" w:line="240" w:lineRule="auto"/>
-              <w:jc w:val="right"/>
-            </w:pPr>
-            <w:r>
-              <w:rPr>
-                <w:rFonts w:ascii="Times New Roman" w:hAnsi="Times New Roman"/>
-                <w:color w:val="000000"/>
-                <w:sz w:val="24"/>
-              </w:rPr>
-              <w:t>2</w:t>
-            </w:r>
-            <w:r>
-              <w:rPr>
-                <w:rFonts w:ascii="Times New Roman" w:hAnsi="Times New Roman"/>
-                <w:color w:val="000000"/>
-                <w:sz w:val="24"/>
-              </w:rPr>
-              <w:br/>
-              <w:t>4 5</w:t>
-            </w:r>
-          </w:p>
-          <w:p>
-            <w:pPr>
-              <w:spacing w:after="0" w:line="240" w:lineRule="auto"/>
-              <w:jc w:val="right"/>
-            </w:pPr>
-          </w:p>
-        </w:tc>
-      </w:tr>
-      <w:tr>
-        <w:tc>
-          <w:tcPr>
-            <w:tcW w:w="4844" w:type="dxa"/>
-            <w:tcBorders>
-              <w:top w:val="single" w:sz="4" w:space="0" w:color="000000"/>
-              <w:left w:val="single" w:sz="4" w:space="0" w:color="000000"/>
-              <w:bottom w:val="single" w:sz="4" w:space="0" w:color="000000"/>
-              <w:right w:val="single" w:sz="4" w:space="0" w:color="000000"/>
-            </w:tcBorders>
-            <w:vAlign w:val="center"/>
-          </w:tcPr>
-          <w:p>
-            <w:pPr>
-              <w:spacing w:after="0" w:line="240" w:lineRule="auto"/>
-              <w:jc w:val="center"/>
-            </w:pPr>
-            <w:r>
-              <w:rPr>
-                <w:rFonts w:ascii="Times New Roman" w:hAnsi="Times New Roman"/>
-                <w:color w:val="000000"/>
-                <w:sz w:val="24"/>
-              </w:rPr>
-              <w:t>3</w:t>
-            </w:r>
-          </w:p>
-        </w:tc>
-        <w:tc>
-          <w:tcPr>
-            <w:tcW w:w="4844" w:type="dxa"/>
-            <w:vMerge/>
-            <w:tcBorders>
-              <w:left w:val="single" w:sz="4" w:space="0" w:color="000000"/>
-              <w:bottom w:val="single" w:sz="4" w:space="0" w:color="000000"/>
-              <w:right w:val="single" w:sz="4" w:space="0" w:color="000000"/>
-            </w:tcBorders>
-            <w:vAlign w:val="center"/>
-          </w:tcPr>
-          <w:p>
-            <w:pPr>
-              <w:spacing w:after="0" w:line="240" w:lineRule="auto"/>
-              <w:jc w:val="right"/>
-            </w:pPr>
-          </w:p>
-        </w:tc>
-      </w:tr>
-    </w:tbl>
     <w:p>
       <w:pPr>
         <w:spacing w:after="0" w:line="240" w:lineRule="auto"/>
@@ -2790,6 +2719,195 @@
           <w:sz w:val="28"/>
         </w:rPr>
         <w:t>.</w:t>
+      </w:r>
+    </w:p>
+    <w:p>
+      <w:pPr>
+        <w:pStyle w:val="21"/>
+        <w:spacing w:before="360" w:after="240" w:line="240" w:lineRule="auto"/>
+        <w:ind w:firstLine="709"/>
+      </w:pPr>
+      <w:r>
+        <w:rPr>
+          <w:rFonts w:ascii="Times New Roman" w:hAnsi="Times New Roman"/>
+          <w:color w:val="000000"/>
+          <w:sz w:val="28"/>
+        </w:rPr>
+        <w:t>2.1 вллввл</w:t>
+      </w:r>
+      <w:proofErr w:type="spellStart"/>
+      <w:r>
+        <w:rPr>
+          <w:rFonts w:ascii="Times New Roman" w:hAnsi="Times New Roman"/>
+          <w:color w:val="000000"/>
+          <w:sz w:val="28"/>
+        </w:rPr>
+      </w:r>
+      <w:proofErr w:type="spellEnd"/>
+    </w:p>
+    <w:tbl>
+      <w:tblPr>
+        <w:tblW w:type="auto" w:w="0"/>
+        <w:tblLayout w:type="fixed"/>
+        <w:tblLook w:firstColumn="1" w:firstRow="1" w:lastColumn="0" w:lastRow="0" w:noHBand="0" w:noVBand="1" w:val="04A0"/>
+      </w:tblPr>
+      <w:tblGrid>
+        <w:gridCol w:w="3230"/>
+        <w:gridCol w:w="3230"/>
+        <w:gridCol w:w="3230"/>
+      </w:tblGrid>
+      <w:tr>
+        <w:tc>
+          <w:tcPr>
+            <w:tcW w:type="dxa" w:w="969"/>
+          </w:tcPr>
+          <w:p/>
+        </w:tc>
+        <w:tc>
+          <w:tcPr>
+            <w:tcW w:type="dxa" w:w="7751"/>
+            <w:vAlign w:val="center"/>
+          </w:tcPr>
+          <w:p>
+            <w:pPr>
+              <w:spacing w:line="240" w:lineRule="auto" w:before="240" w:after="240"/>
+              <w:ind w:left="0" w:right="0" w:firstLine="0"/>
+              <w:jc w:val="center"/>
+            </w:pPr>
+            <w:r>
+              <w:rPr>
+                <w:b w:val="0"/>
+                <w:i w:val="0"/>
+                <w:color w:val="000000"/>
+                <w:sz w:val="28"/>
+              </w:rPr>
+              <m:oMath xmlns:mml="http://www.w3.org/1998/Math/MathML">
+                <m:sSup>
+                  <m:e>
+                    <m:r>
+                      <m:t>6</m:t>
+                    </m:r>
+                  </m:e>
+                  <m:sup>
+                    <m:r>
+                      <m:t>5</m:t>
+                    </m:r>
+                  </m:sup>
+                </m:sSup>
+                <m:r>
+                  <m:t>+α*3=</m:t>
+                </m:r>
+                <m:sSubSup>
+                  <m:e>
+                    <m:r>
+                      <m:t>C</m:t>
+                    </m:r>
+                  </m:e>
+                  <m:sub>
+                    <m:r>
+                      <m:t>7</m:t>
+                    </m:r>
+                  </m:sub>
+                  <m:sup>
+                    <m:r>
+                      <m:t>7</m:t>
+                    </m:r>
+                    <m:r>
+                      <m:t>{}</m:t>
+                    </m:r>
+                  </m:sup>
+                </m:sSubSup>
+              </m:oMath>
+            </w:r>
+          </w:p>
+        </w:tc>
+        <w:tc>
+          <w:tcPr>
+            <w:tcW w:type="dxa" w:w="969"/>
+            <w:vAlign w:val="center"/>
+          </w:tcPr>
+          <w:p>
+            <w:pPr>
+              <w:spacing w:line="240" w:lineRule="auto" w:before="240" w:after="240"/>
+              <w:ind w:left="0" w:right="0" w:firstLine="0"/>
+              <w:jc w:val="right"/>
+            </w:pPr>
+            <w:r>
+              <w:rPr>
+                <w:rFonts w:ascii="Times New Roman" w:hAnsi="Times New Roman"/>
+                <w:b w:val="0"/>
+                <w:i w:val="0"/>
+                <w:color w:val="000000"/>
+                <w:sz w:val="28"/>
+              </w:rPr>
+              <w:t>(2.1)</w:t>
+            </w:r>
+          </w:p>
+        </w:tc>
+      </w:tr>
+    </w:tbl>
+    <w:p>
+      <w:pPr>
+        <w:spacing w:before="280" w:after="0" w:line="240" w:lineRule="auto"/>
+        <w:jc w:val="center"/>
+      </w:pPr>
+      <w:r>
+        <w:rPr>
+          <w:noProof/>
+        </w:rPr>
+        <w:drawing>
+          <wp:inline distT="0" distB="0" distL="0" distR="0" wp14:anchorId="1E3820ED" wp14:editId="6A53E4C2">
+            <wp:extent cx="4733925" cy="2781300"/>
+            <wp:effectExtent l="0" t="0" r="0" b="0"/>
+            <wp:docPr id="2" name="Picture 2"/>
+            <wp:cNvGraphicFramePr>
+              <a:graphicFrameLocks xmlns:a="http://schemas.openxmlformats.org/drawingml/2006/main" noChangeAspect="1"/>
+            </wp:cNvGraphicFramePr>
+            <a:graphic xmlns:a="http://schemas.openxmlformats.org/drawingml/2006/main">
+              <a:graphicData uri="http://schemas.openxmlformats.org/drawingml/2006/picture">
+                <pic:pic xmlns:pic="http://schemas.openxmlformats.org/drawingml/2006/picture">
+                  <pic:nvPicPr>
+                    <pic:cNvPr id="0" name="image.png"/>
+                    <pic:cNvPicPr/>
+                  </pic:nvPicPr>
+                  <pic:blipFill>
+                    <a:blip r:embed="rId7"/>
+                    <a:stretch>
+                      <a:fillRect/>
+                    </a:stretch>
+                  </pic:blipFill>
+                  <pic:spPr>
+                    <a:xfrm>
+                      <a:off x="0" y="0"/>
+                      <a:ext cx="4733925" cy="2781300"/>
+                    </a:xfrm>
+                    <a:prstGeom prst="rect">
+                      <a:avLst/>
+                    </a:prstGeom>
+                  </pic:spPr>
+                </pic:pic>
+              </a:graphicData>
+            </a:graphic>
+          </wp:inline>
+        </w:drawing>
+      </w:r>
+    </w:p>
+    <w:p>
+      <w:pPr>
+        <w:spacing w:before="120" w:after="280" w:line="240" w:lineRule="auto"/>
+        <w:jc w:val="center"/>
+        <w:rPr>
+          <w:lang w:val="ru-RU"/>
+        </w:rPr>
+      </w:pPr>
+      <w:r>
+        <w:rPr>
+          <w:rFonts w:ascii="Times New Roman" w:hAnsi="Times New Roman"/>
+          <w:color w:val="000000"/>
+          <w:sz w:val="28"/>
+          <w:lang w:val="ru-RU"/>
+        </w:rPr>
+        <w:t>Рисунок 2.1 – выв</w:t>
       </w:r>
     </w:p>
     <w:p/>

</xml_diff>

<commit_message>
edit fix bug with move edit naming alig
</commit_message>
<xml_diff>
--- a/foldertest/fsf.docx
+++ b/foldertest/fsf.docx
@@ -18,7 +18,7 @@
           <w:color w:val="000000"/>
           <w:lang w:val="ru-RU"/>
         </w:rPr>
-        <w:t>1 Временный разде да да 1 hf</w:t>
+        <w:t xml:space="preserve">1 Временный разде да </w:t>
       </w:r>
       <w:proofErr w:type="spellStart"/>
       <w:r>
@@ -27,6 +27,7 @@
           <w:color w:val="000000"/>
           <w:lang w:val="ru-RU"/>
         </w:rPr>
+        <w:t>да</w:t>
       </w:r>
       <w:proofErr w:type="spellEnd"/>
       <w:r>
@@ -35,6 +36,7 @@
           <w:color w:val="000000"/>
           <w:lang w:val="ru-RU"/>
         </w:rPr>
+        <w:t xml:space="preserve"> 1 </w:t>
       </w:r>
       <w:proofErr w:type="spellStart"/>
       <w:r>
@@ -43,6 +45,7 @@
           <w:color w:val="000000"/>
           <w:lang w:val="ru-RU"/>
         </w:rPr>
+        <w:t>hf</w:t>
       </w:r>
       <w:proofErr w:type="spellEnd"/>
     </w:p>
@@ -62,7 +65,7 @@
           <w:sz w:val="28"/>
           <w:lang w:val="ru-RU"/>
         </w:rPr>
-        <w:t>1.1 Нету как жадь подраздлffffе 1.1</w:t>
+        <w:t xml:space="preserve">1.1 Нету как </w:t>
       </w:r>
       <w:proofErr w:type="spellStart"/>
       <w:r>
@@ -72,6 +75,7 @@
           <w:sz w:val="28"/>
           <w:lang w:val="ru-RU"/>
         </w:rPr>
+        <w:t>жадь</w:t>
       </w:r>
       <w:proofErr w:type="spellEnd"/>
       <w:r>
@@ -81,6 +85,7 @@
           <w:sz w:val="28"/>
           <w:lang w:val="ru-RU"/>
         </w:rPr>
+        <w:t xml:space="preserve"> </w:t>
       </w:r>
       <w:proofErr w:type="spellStart"/>
       <w:r>
@@ -90,6 +95,7 @@
           <w:sz w:val="28"/>
           <w:lang w:val="ru-RU"/>
         </w:rPr>
+        <w:t>подраздлffffе</w:t>
       </w:r>
       <w:proofErr w:type="spellEnd"/>
       <w:r>
@@ -99,6 +105,7 @@
           <w:sz w:val="28"/>
           <w:lang w:val="ru-RU"/>
         </w:rPr>
+        <w:t xml:space="preserve"> 1.1</w:t>
       </w:r>
     </w:p>
     <w:p>
@@ -202,7 +209,7 @@
           <w:color w:val="000000"/>
           <w:sz w:val="28"/>
         </w:rPr>
-        <w:t>Таблица 1.1 – Кпо ав лввлвлвллвв</w:t>
+        <w:t>Таблица</w:t>
       </w:r>
       <w:proofErr w:type="spellEnd"/>
       <w:r>
@@ -211,6 +218,7 @@
           <w:color w:val="000000"/>
           <w:sz w:val="28"/>
         </w:rPr>
+        <w:t xml:space="preserve"> 1.1 – </w:t>
       </w:r>
       <w:proofErr w:type="spellStart"/>
       <w:r>
@@ -219,6 +227,7 @@
           <w:color w:val="000000"/>
           <w:sz w:val="28"/>
         </w:rPr>
+        <w:t>Кпо</w:t>
       </w:r>
       <w:proofErr w:type="spellEnd"/>
       <w:r>
@@ -227,6 +236,7 @@
           <w:color w:val="000000"/>
           <w:sz w:val="28"/>
         </w:rPr>
+        <w:t xml:space="preserve"> </w:t>
       </w:r>
       <w:proofErr w:type="spellStart"/>
       <w:r>
@@ -235,6 +245,7 @@
           <w:color w:val="000000"/>
           <w:sz w:val="28"/>
         </w:rPr>
+        <w:t>ав</w:t>
       </w:r>
       <w:proofErr w:type="spellEnd"/>
       <w:r>
@@ -243,6 +254,7 @@
           <w:color w:val="000000"/>
           <w:sz w:val="28"/>
         </w:rPr>
+        <w:t xml:space="preserve"> </w:t>
       </w:r>
       <w:proofErr w:type="spellStart"/>
       <w:r>
@@ -251,6 +263,7 @@
           <w:color w:val="000000"/>
           <w:sz w:val="28"/>
         </w:rPr>
+        <w:t>лввлвлвллвв</w:t>
       </w:r>
       <w:proofErr w:type="spellEnd"/>
     </w:p>
@@ -653,7 +666,7 @@
           <w:color w:val="000000"/>
           <w:sz w:val="28"/>
         </w:rPr>
-        <w:t>Рисунок 1.1 – ринско</w:t>
+        <w:t>Рисунок</w:t>
       </w:r>
       <w:proofErr w:type="spellEnd"/>
       <w:r>
@@ -662,6 +675,7 @@
           <w:color w:val="000000"/>
           <w:sz w:val="28"/>
         </w:rPr>
+        <w:t xml:space="preserve"> 1.1 – </w:t>
       </w:r>
       <w:proofErr w:type="spellStart"/>
       <w:r>
@@ -670,6 +684,7 @@
           <w:color w:val="000000"/>
           <w:sz w:val="28"/>
         </w:rPr>
+        <w:t>ринско</w:t>
       </w:r>
       <w:proofErr w:type="spellEnd"/>
     </w:p>
@@ -1068,7 +1083,7 @@
           <w:sz w:val="28"/>
           <w:lang w:val="ru-RU"/>
         </w:rPr>
-        <w:t>Листинг 1.1 – подпи литснг</w:t>
+        <w:t xml:space="preserve">Листинг 1.1 – </w:t>
       </w:r>
       <w:proofErr w:type="spellStart"/>
       <w:r>
@@ -1078,6 +1093,7 @@
           <w:sz w:val="28"/>
           <w:lang w:val="ru-RU"/>
         </w:rPr>
+        <w:t>подпи</w:t>
       </w:r>
       <w:proofErr w:type="spellEnd"/>
       <w:r>
@@ -1087,6 +1103,7 @@
           <w:sz w:val="28"/>
           <w:lang w:val="ru-RU"/>
         </w:rPr>
+        <w:t xml:space="preserve"> </w:t>
       </w:r>
       <w:proofErr w:type="spellStart"/>
       <w:r>
@@ -1096,6 +1113,7 @@
           <w:sz w:val="28"/>
           <w:lang w:val="ru-RU"/>
         </w:rPr>
+        <w:t>литснг</w:t>
       </w:r>
       <w:proofErr w:type="spellEnd"/>
     </w:p>
@@ -1168,7 +1186,7 @@
           <w:sz w:val="28"/>
           <w:lang w:val="ru-RU"/>
         </w:rPr>
-        <w:t>Листинг 1.2 – выввыввы</w:t>
+        <w:t xml:space="preserve">Листинг 1.2 – </w:t>
       </w:r>
       <w:proofErr w:type="spellStart"/>
       <w:r>
@@ -1178,6 +1196,7 @@
           <w:sz w:val="28"/>
           <w:lang w:val="ru-RU"/>
         </w:rPr>
+        <w:t>выввыввы</w:t>
       </w:r>
       <w:proofErr w:type="spellEnd"/>
     </w:p>
@@ -1362,7 +1381,7 @@
           <w:color w:val="000000"/>
           <w:sz w:val="28"/>
         </w:rPr>
-        <w:t>1.1.1 театуоа у</w:t>
+        <w:t xml:space="preserve">1.1.1 </w:t>
       </w:r>
       <w:proofErr w:type="spellStart"/>
       <w:r>
@@ -1371,6 +1390,7 @@
           <w:color w:val="000000"/>
           <w:sz w:val="28"/>
         </w:rPr>
+        <w:t>театуоа</w:t>
       </w:r>
       <w:proofErr w:type="spellEnd"/>
       <w:r>
@@ -1379,6 +1399,7 @@
           <w:color w:val="000000"/>
           <w:sz w:val="28"/>
         </w:rPr>
+        <w:t xml:space="preserve"> у</w:t>
       </w:r>
     </w:p>
     <w:p>
@@ -1480,7 +1501,7 @@
           <w:sz w:val="28"/>
           <w:lang w:val="ru-RU"/>
         </w:rPr>
-        <w:t>1.2 дава провери дурака</w:t>
+        <w:t xml:space="preserve">1.2 </w:t>
       </w:r>
       <w:proofErr w:type="spellStart"/>
       <w:r>
@@ -1490,6 +1511,7 @@
           <w:sz w:val="28"/>
           <w:lang w:val="ru-RU"/>
         </w:rPr>
+        <w:t>дава</w:t>
       </w:r>
       <w:proofErr w:type="spellEnd"/>
       <w:r>
@@ -1499,6 +1521,7 @@
           <w:sz w:val="28"/>
           <w:lang w:val="ru-RU"/>
         </w:rPr>
+        <w:t xml:space="preserve"> </w:t>
       </w:r>
       <w:proofErr w:type="spellStart"/>
       <w:r>
@@ -1508,6 +1531,7 @@
           <w:sz w:val="28"/>
           <w:lang w:val="ru-RU"/>
         </w:rPr>
+        <w:t>провери</w:t>
       </w:r>
       <w:proofErr w:type="spellEnd"/>
       <w:r>
@@ -1517,6 +1541,7 @@
           <w:sz w:val="28"/>
           <w:lang w:val="ru-RU"/>
         </w:rPr>
+        <w:t xml:space="preserve"> дурака</w:t>
       </w:r>
     </w:p>
     <w:p>
@@ -1554,7 +1579,7 @@
           <w:sz w:val="28"/>
           <w:lang w:val="ru-RU"/>
         </w:rPr>
-        <w:t>1.3 тест подарезд</w:t>
+        <w:t xml:space="preserve">1.3 тест </w:t>
       </w:r>
       <w:proofErr w:type="spellStart"/>
       <w:r>
@@ -1564,6 +1589,7 @@
           <w:sz w:val="28"/>
           <w:lang w:val="ru-RU"/>
         </w:rPr>
+        <w:t>подарезд</w:t>
       </w:r>
       <w:proofErr w:type="spellEnd"/>
     </w:p>
@@ -1604,7 +1630,8 @@
           <w:color w:val="000000"/>
           <w:lang w:val="ru-RU"/>
         </w:rPr>
-        <w:t>2 да новы 3 но он 2 к-то</w:t>
+        <w:lastRenderedPageBreak/>
+        <w:t xml:space="preserve">2 да новы </w:t>
       </w:r>
       <w:proofErr w:type="gramStart"/>
       <w:r>
@@ -1613,6 +1640,7 @@
           <w:color w:val="000000"/>
           <w:lang w:val="ru-RU"/>
         </w:rPr>
+        <w:t>3</w:t>
       </w:r>
       <w:proofErr w:type="gramEnd"/>
       <w:r>
@@ -1621,6 +1649,7 @@
           <w:color w:val="000000"/>
           <w:lang w:val="ru-RU"/>
         </w:rPr>
+        <w:t xml:space="preserve"> но он 2 к-то</w:t>
       </w:r>
     </w:p>
     <w:p>
@@ -1686,7 +1715,7 @@
           <w:color w:val="000000"/>
           <w:sz w:val="28"/>
         </w:rPr>
-        <w:t>Таблица 2.1 – Описание</w:t>
+        <w:t>Таблица</w:t>
       </w:r>
       <w:proofErr w:type="spellEnd"/>
       <w:r>
@@ -1695,6 +1724,7 @@
           <w:color w:val="000000"/>
           <w:sz w:val="28"/>
         </w:rPr>
+        <w:t xml:space="preserve"> 2.1 – </w:t>
       </w:r>
       <w:proofErr w:type="spellStart"/>
       <w:r>
@@ -1703,6 +1733,7 @@
           <w:color w:val="000000"/>
           <w:sz w:val="28"/>
         </w:rPr>
+        <w:t>Описание</w:t>
       </w:r>
       <w:proofErr w:type="spellEnd"/>
     </w:p>
@@ -1912,7 +1943,7 @@
           <w:sz w:val="28"/>
           <w:lang w:val="ru-RU"/>
         </w:rPr>
-        <w:t>Таблица 2.2 – ОписаниеDS ADSA</w:t>
+        <w:t xml:space="preserve">Таблица 2.2 – </w:t>
       </w:r>
       <w:proofErr w:type="spellStart"/>
       <w:r>
@@ -1922,6 +1953,7 @@
           <w:sz w:val="28"/>
           <w:lang w:val="ru-RU"/>
         </w:rPr>
+        <w:t>ОписаниеDS</w:t>
       </w:r>
       <w:proofErr w:type="spellEnd"/>
       <w:r>
@@ -1931,6 +1963,7 @@
           <w:sz w:val="28"/>
           <w:lang w:val="ru-RU"/>
         </w:rPr>
+        <w:t xml:space="preserve"> ADSA</w:t>
       </w:r>
     </w:p>
     <w:tbl>
@@ -1951,7 +1984,7 @@
       <w:tr>
         <w:trPr>
           <w:cantSplit/>
-          <w:trHeight w:val="1134"/>
+          <w:trHeight w:val="1380"/>
         </w:trPr>
         <w:tc>
           <w:tcPr>
@@ -2109,7 +2142,7 @@
       </w:tr>
       <w:tr>
         <w:trPr>
-          <w:trHeight w:val="276"/>
+          <w:trHeight w:val="1380"/>
         </w:trPr>
         <w:tc>
           <w:tcPr>
@@ -2146,10 +2179,12 @@
               <w:left w:val="single" w:sz="4" w:space="0" w:color="000000"/>
               <w:right w:val="single" w:sz="4" w:space="0" w:color="000000"/>
             </w:tcBorders>
+            <w:textDirection w:val="btLr"/>
           </w:tcPr>
           <w:p>
             <w:pPr>
               <w:spacing w:after="0" w:line="240" w:lineRule="auto"/>
+              <w:ind w:left="113" w:right="113"/>
               <w:jc w:val="right"/>
               <w:rPr>
                 <w:rFonts w:ascii="Times New Roman" w:hAnsi="Times New Roman"/>
@@ -2170,6 +2205,7 @@
           <w:p>
             <w:pPr>
               <w:spacing w:after="0" w:line="240" w:lineRule="auto"/>
+              <w:ind w:left="113" w:right="113"/>
               <w:jc w:val="both"/>
               <w:rPr>
                 <w:rFonts w:ascii="Times New Roman" w:hAnsi="Times New Roman"/>
@@ -2182,6 +2218,7 @@
           <w:p>
             <w:pPr>
               <w:spacing w:after="0" w:line="240" w:lineRule="auto"/>
+              <w:ind w:left="113" w:right="113"/>
               <w:jc w:val="both"/>
               <w:rPr>
                 <w:rFonts w:ascii="Times New Roman" w:hAnsi="Times New Roman"/>
@@ -2194,6 +2231,7 @@
           <w:p>
             <w:pPr>
               <w:spacing w:after="0" w:line="240" w:lineRule="auto"/>
+              <w:ind w:left="113" w:right="113"/>
               <w:jc w:val="both"/>
               <w:rPr>
                 <w:rFonts w:ascii="Times New Roman" w:hAnsi="Times New Roman"/>
@@ -2205,6 +2243,7 @@
           <w:p>
             <w:pPr>
               <w:spacing w:after="0" w:line="240" w:lineRule="auto"/>
+              <w:ind w:left="113" w:right="113"/>
               <w:jc w:val="both"/>
               <w:rPr>
                 <w:rFonts w:ascii="Times New Roman" w:hAnsi="Times New Roman"/>
@@ -2217,6 +2256,7 @@
           <w:p>
             <w:pPr>
               <w:spacing w:after="0" w:line="240" w:lineRule="auto"/>
+              <w:ind w:left="113" w:right="113"/>
               <w:jc w:val="right"/>
               <w:rPr>
                 <w:rFonts w:ascii="Times New Roman" w:hAnsi="Times New Roman"/>
@@ -2230,7 +2270,7 @@
       </w:tr>
       <w:tr>
         <w:trPr>
-          <w:trHeight w:val="78"/>
+          <w:trHeight w:val="1380"/>
         </w:trPr>
         <w:tc>
           <w:tcPr>
@@ -2333,7 +2373,7 @@
       </w:tr>
       <w:tr>
         <w:trPr>
-          <w:trHeight w:val="76"/>
+          <w:trHeight w:val="1380"/>
         </w:trPr>
         <w:tc>
           <w:tcPr>
@@ -2448,7 +2488,7 @@
       </w:tr>
       <w:tr>
         <w:trPr>
-          <w:trHeight w:val="76"/>
+          <w:trHeight w:val="1380"/>
         </w:trPr>
         <w:tc>
           <w:tcPr>
@@ -2572,6 +2612,9 @@
         </w:tc>
       </w:tr>
       <w:tr>
+        <w:trPr>
+          <w:trHeight w:val="1380"/>
+        </w:trPr>
         <w:tc>
           <w:tcPr>
             <w:tcW w:w="2422" w:type="dxa"/>
@@ -2631,14 +2674,7 @@
           <w:color w:val="000000"/>
           <w:sz w:val="28"/>
         </w:rPr>
-        <w:t>Ntrcnf vyjuj yt, sdftn yjdjn jy  b ,sdftnNtrcnf vyjuj yt, sdftn yjdjn jy  b ,sdftnNtrcnf vyjuj yt, sdftn yjdjn jy  b ,sdftnNtrcnf vyjuj yt, e3432sdftn yjdjn jy  b ,sdftn</w:t>
-      </w:r>
-      <w:r>
-        <w:rPr>
-          <w:rFonts w:ascii="Times New Roman" w:hAnsi="Times New Roman"/>
-          <w:color w:val="000000"/>
-          <w:sz w:val="28"/>
-        </w:rPr>
+        <w:t xml:space="preserve">Ntrcnf vyjuj yt, sdftn yjdjn </w:t>
       </w:r>
       <w:proofErr w:type="gramStart"/>
       <w:r>
@@ -2647,6 +2683,7 @@
           <w:color w:val="000000"/>
           <w:sz w:val="28"/>
         </w:rPr>
+        <w:t>jy  b</w:t>
       </w:r>
       <w:proofErr w:type="gramEnd"/>
       <w:r>
@@ -2655,6 +2692,7 @@
           <w:color w:val="000000"/>
           <w:sz w:val="28"/>
         </w:rPr>
+        <w:t xml:space="preserve"> ,sdftnNtrcnf vyjuj yt, sdftn yjdjn jy  b ,sdftnNtrcnf vyjuj yt, sdftn yjdjn jy  b ,sdftnNtrcnf vyjuj yt, e3432sdftn yjdjn jy  b ,sdftn</w:t>
       </w:r>
     </w:p>
     <w:p>
@@ -2679,6 +2717,7 @@
           <w:sz w:val="28"/>
           <w:lang w:val="ru-RU"/>
         </w:rPr>
+        <w:lastRenderedPageBreak/>
         <w:t>Вот</w:t>
       </w:r>
     </w:p>
@@ -2726,7 +2765,7 @@
           <w:color w:val="000000"/>
           <w:sz w:val="28"/>
         </w:rPr>
-        <w:t>2.1 вллввл</w:t>
+        <w:t xml:space="preserve">2.1 </w:t>
       </w:r>
       <w:proofErr w:type="spellStart"/>
       <w:r>
@@ -2735,6 +2774,7 @@
           <w:color w:val="000000"/>
           <w:sz w:val="28"/>
         </w:rPr>
+        <w:t>вллввл</w:t>
       </w:r>
       <w:proofErr w:type="spellEnd"/>
     </w:p>
@@ -2799,25 +2839,7 @@
                   <w:rPr>
                     <w:rFonts w:ascii="Cambria Math" w:hAnsi="Cambria Math"/>
                   </w:rPr>
-                  <m:t>+</m:t>
-                </m:r>
-                <m:r>
-                  <w:rPr>
-                    <w:rFonts w:ascii="Cambria Math" w:hAnsi="Cambria Math"/>
-                  </w:rPr>
-                  <m:t>α</m:t>
-                </m:r>
-                <m:r>
-                  <w:rPr>
-                    <w:rFonts w:ascii="Cambria Math" w:hAnsi="Cambria Math"/>
-                  </w:rPr>
-                  <m:t>*</m:t>
-                </m:r>
-                <m:r>
-                  <w:rPr>
-                    <w:rFonts w:ascii="Cambria Math" w:hAnsi="Cambria Math"/>
-                  </w:rPr>
-                  <m:t>3=</m:t>
+                  <m:t>+α*3=</m:t>
                 </m:r>
                 <m:sSubSup>
                   <m:sSubSupPr>
@@ -2887,7 +2909,6 @@
         <w:rPr>
           <w:noProof/>
         </w:rPr>
-        <w:lastRenderedPageBreak/>
         <w:drawing>
           <wp:inline distT="0" distB="0" distL="0" distR="0" wp14:anchorId="3BC53178" wp14:editId="17079B51">
             <wp:extent cx="4733925" cy="2781300"/>

</xml_diff>